<commit_message>
Update report with recent changes
</commit_message>
<xml_diff>
--- a/Practice_otchet.docx
+++ b/Practice_otchet.docx
@@ -1,8 +1,8 @@
 
 <file path=word/document.xml><?xml version="1.0" encoding="utf-8"?>
-<w:document xmlns:wpc="http://schemas.microsoft.com/office/word/2010/wordprocessingCanvas" xmlns:cx="http://schemas.microsoft.com/office/drawing/2014/chartex" xmlns:cx1="http://schemas.microsoft.com/office/drawing/2015/9/8/chartex" xmlns:cx2="http://schemas.microsoft.com/office/drawing/2015/10/21/chartex" xmlns:cx3="http://schemas.microsoft.com/office/drawing/2016/5/9/chartex" xmlns:cx4="http://schemas.microsoft.com/office/drawing/2016/5/10/chartex" xmlns:cx5="http://schemas.microsoft.com/office/drawing/2016/5/11/chartex" xmlns:cx6="http://schemas.microsoft.com/office/drawing/2016/5/12/chartex" xmlns:cx7="http://schemas.microsoft.com/office/drawing/2016/5/13/chartex" xmlns:cx8="http://schemas.microsoft.com/office/drawing/2016/5/14/chartex" xmlns:mc="http://schemas.openxmlformats.org/markup-compatibility/2006" xmlns:aink="http://schemas.microsoft.com/office/drawing/2016/ink" xmlns:am3d="http://schemas.microsoft.com/office/drawing/2017/model3d" xmlns:o="urn:schemas-microsoft-com:office:office" xmlns:oel="http://schemas.microsoft.com/office/2019/extlst" xmlns:r="http://schemas.openxmlformats.org/officeDocument/2006/relationships" xmlns:m="http://schemas.openxmlformats.org/officeDocument/2006/math" xmlns:v="urn:schemas-microsoft-com:vml" xmlns:wp14="http://schemas.microsoft.com/office/word/2010/wordprocessingDrawing" xmlns:wp="http://schemas.openxmlformats.org/drawingml/2006/wordprocessingDrawing" xmlns:w10="urn:schemas-microsoft-com:office:word" xmlns:w="http://schemas.openxmlformats.org/wordprocessingml/2006/main" xmlns:w14="http://schemas.microsoft.com/office/word/2010/wordml" xmlns:w15="http://schemas.microsoft.com/office/word/2012/wordml" xmlns:w16cex="http://schemas.microsoft.com/office/word/2018/wordml/cex" xmlns:w16cid="http://schemas.microsoft.com/office/word/2016/wordml/cid" xmlns:w16="http://schemas.microsoft.com/office/word/2018/wordml" xmlns:w16du="http://schemas.microsoft.com/office/word/2023/wordml/word16du" xmlns:w16sdtdh="http://schemas.microsoft.com/office/word/2020/wordml/sdtdatahash" xmlns:w16sdtfl="http://schemas.microsoft.com/office/word/2024/wordml/sdtformatlock" xmlns:w16se="http://schemas.microsoft.com/office/word/2015/wordml/symex" xmlns:wpg="http://schemas.microsoft.com/office/word/2010/wordprocessingGroup" xmlns:wpi="http://schemas.microsoft.com/office/word/2010/wordprocessingInk" xmlns:wne="http://schemas.microsoft.com/office/word/2006/wordml" xmlns:wps="http://schemas.microsoft.com/office/word/2010/wordprocessingShape" mc:Ignorable="w14 w15 w16se w16cid w16 w16cex w16sdtdh w16sdtfl w16du wp14">
+<w:document xmlns:ns1="http://schemas.openxmlformats.org/markup-compatibility/2006" xmlns:ns2="http://schemas.microsoft.com/office/word/2010/wordml" xmlns:ns3="http://schemas.openxmlformats.org/officeDocument/2006/relationships" xmlns:ns4="http://schemas.openxmlformats.org/drawingml/2006/wordprocessingDrawing" xmlns:ns5="http://schemas.microsoft.com/office/word/2010/wordprocessingDrawing" xmlns:ns6="http://schemas.openxmlformats.org/drawingml/2006/main" xmlns:ns7="http://schemas.openxmlformats.org/drawingml/2006/picture" xmlns:ns8="http://schemas.microsoft.com/office/drawing/2010/main" xmlns:w="http://schemas.openxmlformats.org/wordprocessingml/2006/main" ns1:Ignorable="w14 w15 w16se w16cid w16 w16cex w16sdtdh w16sdtfl w16du wp14">
   <w:body>
-    <w:p>
+    <w:p ns2:paraId="574D9B32" ns2:textId="77777777">
       <w:pPr>
         <w:spacing w:after="0" w:line="360" w:lineRule="auto"/>
         <w:jc w:val="center"/>
@@ -23,7 +23,7 @@
         <w:t>МИНИСТЕРСТВО НАУКИ И ВЫСШЕГО ОБРАЗОВАНИЯ</w:t>
       </w:r>
     </w:p>
-    <w:p>
+    <w:p ns2:paraId="5747B517" ns2:textId="77777777">
       <w:pPr>
         <w:spacing w:after="0" w:line="360" w:lineRule="auto"/>
         <w:jc w:val="center"/>
@@ -42,7 +42,7 @@
         <w:t>РОССИЙСКОЙ ФЕДЕРАЦИИ</w:t>
       </w:r>
     </w:p>
-    <w:p>
+    <w:p ns2:paraId="74FB0AB8" ns2:textId="77777777">
       <w:pPr>
         <w:spacing w:after="0" w:line="360" w:lineRule="auto"/>
         <w:jc w:val="center"/>
@@ -61,7 +61,7 @@
         <w:t>ПЕНЗЕНСКИЙ ГОСУДАРСТВЕННЫЙ УНИВЕРСИТЕТ</w:t>
       </w:r>
     </w:p>
-    <w:p>
+    <w:p ns2:paraId="5DD72D1A" ns2:textId="77777777">
       <w:pPr>
         <w:spacing w:after="0" w:line="360" w:lineRule="auto"/>
         <w:jc w:val="center"/>
@@ -80,7 +80,7 @@
         <w:t>Кафедра «Системы автоматизированного проектирования»</w:t>
       </w:r>
     </w:p>
-    <w:p>
+    <w:p ns2:paraId="22EA2CD1" ns2:textId="77777777">
       <w:pPr>
         <w:spacing w:after="0" w:line="360" w:lineRule="auto"/>
         <w:jc w:val="center"/>
@@ -91,7 +91,7 @@
         </w:rPr>
       </w:pPr>
     </w:p>
-    <w:p>
+    <w:p ns2:paraId="0CC616C2" ns2:textId="77777777">
       <w:pPr>
         <w:spacing w:after="0" w:line="360" w:lineRule="auto"/>
         <w:jc w:val="center"/>
@@ -102,7 +102,7 @@
         </w:rPr>
       </w:pPr>
     </w:p>
-    <w:p>
+    <w:p ns2:paraId="2663D93C" ns2:textId="77777777">
       <w:pPr>
         <w:spacing w:after="0" w:line="360" w:lineRule="auto"/>
         <w:jc w:val="center"/>
@@ -113,7 +113,7 @@
         </w:rPr>
       </w:pPr>
     </w:p>
-    <w:p>
+    <w:p ns2:paraId="5F919495" ns2:textId="77777777">
       <w:pPr>
         <w:spacing w:after="0" w:line="360" w:lineRule="auto"/>
         <w:jc w:val="center"/>
@@ -134,7 +134,7 @@
         <w:t>ОТЧЕТ</w:t>
       </w:r>
     </w:p>
-    <w:p>
+    <w:p ns2:paraId="6EFE0466" ns2:textId="77777777">
       <w:pPr>
         <w:spacing w:after="0" w:line="360" w:lineRule="auto"/>
         <w:jc w:val="center"/>
@@ -155,7 +155,7 @@
         <w:t>По учебно-технологической практике</w:t>
       </w:r>
     </w:p>
-    <w:p>
+    <w:p ns2:paraId="21FBA8F4" ns2:textId="21299508">
       <w:pPr>
         <w:spacing w:after="0" w:line="360" w:lineRule="auto"/>
         <w:jc w:val="center"/>
@@ -214,7 +214,7 @@
         <w:t>»</w:t>
       </w:r>
     </w:p>
-    <w:p>
+    <w:p ns2:paraId="4E8D61B2" ns2:textId="77777777">
       <w:pPr>
         <w:spacing w:after="0" w:line="360" w:lineRule="auto"/>
         <w:jc w:val="center"/>
@@ -225,7 +225,7 @@
         </w:rPr>
       </w:pPr>
     </w:p>
-    <w:p>
+    <w:p ns2:paraId="20E9C754" ns2:textId="77777777">
       <w:pPr>
         <w:spacing w:after="0" w:line="360" w:lineRule="auto"/>
         <w:jc w:val="center"/>
@@ -236,7 +236,7 @@
         </w:rPr>
       </w:pPr>
     </w:p>
-    <w:p>
+    <w:p ns2:paraId="439096F1" ns2:textId="77777777">
       <w:pPr>
         <w:spacing w:after="0" w:line="360" w:lineRule="auto"/>
         <w:jc w:val="center"/>
@@ -247,7 +247,7 @@
         </w:rPr>
       </w:pPr>
     </w:p>
-    <w:p>
+    <w:p ns2:paraId="1CFB6296" ns2:textId="77777777">
       <w:pPr>
         <w:spacing w:after="0" w:line="360" w:lineRule="auto"/>
         <w:jc w:val="center"/>
@@ -266,7 +266,7 @@
         <w:t>Направление подготовки – 02.03.03 Математическое обеспечение и администрирование информационных систем</w:t>
       </w:r>
     </w:p>
-    <w:p>
+    <w:p ns2:paraId="7301CF75" ns2:textId="77777777">
       <w:pPr>
         <w:spacing w:after="0" w:line="360" w:lineRule="auto"/>
         <w:jc w:val="center"/>
@@ -285,47 +285,47 @@
         <w:t>Профиль подготовки – Администрирование информационных систем</w:t>
       </w:r>
     </w:p>
-    <w:p>
-      <w:pPr>
-        <w:spacing w:after="0" w:line="360" w:lineRule="auto"/>
-        <w:rPr>
-          <w:rFonts w:ascii="Times New Roman" w:hAnsi="Times New Roman"/>
-          <w:sz w:val="28"/>
-          <w:szCs w:val="28"/>
-        </w:rPr>
-      </w:pPr>
-    </w:p>
-    <w:p>
-      <w:pPr>
-        <w:spacing w:after="0" w:line="360" w:lineRule="auto"/>
-        <w:rPr>
-          <w:rFonts w:ascii="Times New Roman" w:hAnsi="Times New Roman"/>
-          <w:sz w:val="28"/>
-          <w:szCs w:val="28"/>
-        </w:rPr>
-      </w:pPr>
-    </w:p>
-    <w:p>
-      <w:pPr>
-        <w:spacing w:after="0" w:line="360" w:lineRule="auto"/>
-        <w:rPr>
-          <w:rFonts w:ascii="Times New Roman" w:hAnsi="Times New Roman"/>
-          <w:sz w:val="28"/>
-          <w:szCs w:val="28"/>
-        </w:rPr>
-      </w:pPr>
-    </w:p>
-    <w:p>
-      <w:pPr>
-        <w:spacing w:after="0" w:line="360" w:lineRule="auto"/>
-        <w:rPr>
-          <w:rFonts w:ascii="Times New Roman" w:hAnsi="Times New Roman"/>
-          <w:sz w:val="28"/>
-          <w:szCs w:val="28"/>
-        </w:rPr>
-      </w:pPr>
-    </w:p>
-    <w:p>
+    <w:p ns2:paraId="2780B9D6" ns2:textId="77777777">
+      <w:pPr>
+        <w:spacing w:after="0" w:line="360" w:lineRule="auto"/>
+        <w:rPr>
+          <w:rFonts w:ascii="Times New Roman" w:hAnsi="Times New Roman"/>
+          <w:sz w:val="28"/>
+          <w:szCs w:val="28"/>
+        </w:rPr>
+      </w:pPr>
+    </w:p>
+    <w:p ns2:paraId="106603D0" ns2:textId="77777777">
+      <w:pPr>
+        <w:spacing w:after="0" w:line="360" w:lineRule="auto"/>
+        <w:rPr>
+          <w:rFonts w:ascii="Times New Roman" w:hAnsi="Times New Roman"/>
+          <w:sz w:val="28"/>
+          <w:szCs w:val="28"/>
+        </w:rPr>
+      </w:pPr>
+    </w:p>
+    <w:p ns2:paraId="34ACF777" ns2:textId="77777777">
+      <w:pPr>
+        <w:spacing w:after="0" w:line="360" w:lineRule="auto"/>
+        <w:rPr>
+          <w:rFonts w:ascii="Times New Roman" w:hAnsi="Times New Roman"/>
+          <w:sz w:val="28"/>
+          <w:szCs w:val="28"/>
+        </w:rPr>
+      </w:pPr>
+    </w:p>
+    <w:p ns2:paraId="6A9E4CD8" ns2:textId="77777777">
+      <w:pPr>
+        <w:spacing w:after="0" w:line="360" w:lineRule="auto"/>
+        <w:rPr>
+          <w:rFonts w:ascii="Times New Roman" w:hAnsi="Times New Roman"/>
+          <w:sz w:val="28"/>
+          <w:szCs w:val="28"/>
+        </w:rPr>
+      </w:pPr>
+    </w:p>
+    <w:p ns2:paraId="55F6F8A6" ns2:textId="2CFB0B46">
       <w:pPr>
         <w:spacing w:after="0" w:line="360" w:lineRule="auto"/>
         <w:jc w:val="right"/>
@@ -368,7 +368,7 @@
         <w:t>Ш.</w:t>
       </w:r>
     </w:p>
-    <w:p>
+    <w:p ns2:paraId="7EADCDA5" ns2:textId="43E7C712">
       <w:pPr>
         <w:spacing w:after="0" w:line="360" w:lineRule="auto"/>
         <w:jc w:val="right"/>
@@ -413,7 +413,7 @@
         <w:t>ВА1</w:t>
       </w:r>
     </w:p>
-    <w:p>
+    <w:p ns2:paraId="6CB72EDF" ns2:textId="77777777">
       <w:pPr>
         <w:spacing w:after="0" w:line="360" w:lineRule="auto"/>
         <w:jc w:val="right"/>
@@ -432,7 +432,7 @@
         <w:t>Руководитель:</w:t>
       </w:r>
     </w:p>
-    <w:p>
+    <w:p ns2:paraId="4A8E0BA2" ns2:textId="74976807">
       <w:pPr>
         <w:spacing w:after="0" w:line="360" w:lineRule="auto"/>
         <w:jc w:val="right"/>
@@ -461,47 +461,47 @@
       </w:r>
       <w:proofErr w:type="gramEnd"/>
     </w:p>
-    <w:p>
-      <w:pPr>
-        <w:spacing w:after="0" w:line="360" w:lineRule="auto"/>
-        <w:rPr>
-          <w:rFonts w:ascii="Times New Roman" w:hAnsi="Times New Roman"/>
-          <w:sz w:val="28"/>
-          <w:szCs w:val="28"/>
-        </w:rPr>
-      </w:pPr>
-    </w:p>
-    <w:p>
-      <w:pPr>
-        <w:spacing w:after="0" w:line="360" w:lineRule="auto"/>
-        <w:rPr>
-          <w:rFonts w:ascii="Times New Roman" w:hAnsi="Times New Roman"/>
-          <w:sz w:val="28"/>
-          <w:szCs w:val="28"/>
-        </w:rPr>
-      </w:pPr>
-    </w:p>
-    <w:p>
-      <w:pPr>
-        <w:spacing w:after="0" w:line="360" w:lineRule="auto"/>
-        <w:rPr>
-          <w:rFonts w:ascii="Times New Roman" w:hAnsi="Times New Roman"/>
-          <w:sz w:val="28"/>
-          <w:szCs w:val="28"/>
-        </w:rPr>
-      </w:pPr>
-    </w:p>
-    <w:p>
-      <w:pPr>
-        <w:spacing w:after="0" w:line="360" w:lineRule="auto"/>
-        <w:rPr>
-          <w:rFonts w:ascii="Times New Roman" w:hAnsi="Times New Roman"/>
-          <w:sz w:val="28"/>
-          <w:szCs w:val="28"/>
-        </w:rPr>
-      </w:pPr>
-    </w:p>
-    <w:p>
+    <w:p ns2:paraId="466131F9" ns2:textId="77777777">
+      <w:pPr>
+        <w:spacing w:after="0" w:line="360" w:lineRule="auto"/>
+        <w:rPr>
+          <w:rFonts w:ascii="Times New Roman" w:hAnsi="Times New Roman"/>
+          <w:sz w:val="28"/>
+          <w:szCs w:val="28"/>
+        </w:rPr>
+      </w:pPr>
+    </w:p>
+    <w:p ns2:paraId="19C6FB6B" ns2:textId="77777777">
+      <w:pPr>
+        <w:spacing w:after="0" w:line="360" w:lineRule="auto"/>
+        <w:rPr>
+          <w:rFonts w:ascii="Times New Roman" w:hAnsi="Times New Roman"/>
+          <w:sz w:val="28"/>
+          <w:szCs w:val="28"/>
+        </w:rPr>
+      </w:pPr>
+    </w:p>
+    <w:p ns2:paraId="01A8092C" ns2:textId="77777777">
+      <w:pPr>
+        <w:spacing w:after="0" w:line="360" w:lineRule="auto"/>
+        <w:rPr>
+          <w:rFonts w:ascii="Times New Roman" w:hAnsi="Times New Roman"/>
+          <w:sz w:val="28"/>
+          <w:szCs w:val="28"/>
+        </w:rPr>
+      </w:pPr>
+    </w:p>
+    <w:p ns2:paraId="26749389" ns2:textId="77777777">
+      <w:pPr>
+        <w:spacing w:after="0" w:line="360" w:lineRule="auto"/>
+        <w:rPr>
+          <w:rFonts w:ascii="Times New Roman" w:hAnsi="Times New Roman"/>
+          <w:sz w:val="28"/>
+          <w:szCs w:val="28"/>
+        </w:rPr>
+      </w:pPr>
+    </w:p>
+    <w:p ns2:paraId="614CAB3C" ns2:textId="25898042">
       <w:pPr>
         <w:spacing w:after="0" w:line="360" w:lineRule="auto"/>
         <w:jc w:val="center"/>
@@ -577,7 +577,7 @@
         </w:rPr>
       </w:sdtEndPr>
       <w:sdtContent>
-        <w:p>
+        <w:p ns2:paraId="287EC091" ns2:textId="67CF6BCD">
           <w:pPr>
             <w:pStyle w:val="a6"/>
             <w:spacing w:line="360" w:lineRule="auto"/>
@@ -599,7 +599,7 @@
             <w:t>Содержание</w:t>
           </w:r>
         </w:p>
-        <w:p>
+        <w:p ns2:paraId="042332CA" ns2:textId="0F06D1C4">
           <w:pPr>
             <w:pStyle w:val="11"/>
             <w:tabs>
@@ -613,7 +613,7 @@
               <w:sz w:val="28"/>
               <w:szCs w:val="28"/>
               <w:lang w:eastAsia="ru-RU"/>
-              <w14:ligatures w14:val="standardContextual"/>
+              <ns2:ligatures ns2:val="standardContextual"/>
             </w:rPr>
           </w:pPr>
           <w:r>
@@ -723,7 +723,7 @@
             </w:r>
           </w:hyperlink>
         </w:p>
-        <w:p>
+        <w:p ns2:paraId="556013A6" ns2:textId="7A0D9B89">
           <w:pPr>
             <w:pStyle w:val="11"/>
             <w:tabs>
@@ -737,7 +737,7 @@
               <w:sz w:val="28"/>
               <w:szCs w:val="28"/>
               <w:lang w:eastAsia="ru-RU"/>
-              <w14:ligatures w14:val="standardContextual"/>
+              <ns2:ligatures ns2:val="standardContextual"/>
             </w:rPr>
           </w:pPr>
           <w:hyperlink w:anchor="_Toc231405153" w:history="1">
@@ -823,7 +823,7 @@
             </w:r>
           </w:hyperlink>
         </w:p>
-        <w:p>
+        <w:p ns2:paraId="61DE9DD8" ns2:textId="77598B40">
           <w:pPr>
             <w:pStyle w:val="11"/>
             <w:tabs>
@@ -837,7 +837,7 @@
               <w:sz w:val="28"/>
               <w:szCs w:val="28"/>
               <w:lang w:eastAsia="ru-RU"/>
-              <w14:ligatures w14:val="standardContextual"/>
+              <ns2:ligatures ns2:val="standardContextual"/>
             </w:rPr>
           </w:pPr>
           <w:hyperlink w:anchor="_Toc231405154" w:history="1">
@@ -923,7 +923,7 @@
             </w:r>
           </w:hyperlink>
         </w:p>
-        <w:p>
+        <w:p ns2:paraId="345A5FCE" ns2:textId="51570126">
           <w:pPr>
             <w:pStyle w:val="11"/>
             <w:tabs>
@@ -938,7 +938,7 @@
               <w:sz w:val="28"/>
               <w:szCs w:val="28"/>
               <w:lang w:eastAsia="ru-RU"/>
-              <w14:ligatures w14:val="standardContextual"/>
+              <ns2:ligatures ns2:val="standardContextual"/>
             </w:rPr>
           </w:pPr>
           <w:hyperlink w:anchor="_Toc231405155" w:history="1">
@@ -1024,7 +1024,7 @@
             </w:r>
           </w:hyperlink>
         </w:p>
-        <w:p>
+        <w:p ns2:paraId="0A1A30BD" ns2:textId="08ADBDD5">
           <w:pPr>
             <w:pStyle w:val="11"/>
             <w:tabs>
@@ -1039,7 +1039,7 @@
               <w:sz w:val="28"/>
               <w:szCs w:val="28"/>
               <w:lang w:eastAsia="ru-RU"/>
-              <w14:ligatures w14:val="standardContextual"/>
+              <ns2:ligatures ns2:val="standardContextual"/>
             </w:rPr>
           </w:pPr>
           <w:hyperlink w:anchor="_Toc231405156" w:history="1">
@@ -1125,7 +1125,7 @@
             </w:r>
           </w:hyperlink>
         </w:p>
-        <w:p>
+        <w:p ns2:paraId="29CC8067" ns2:textId="3483EECE">
           <w:pPr>
             <w:pStyle w:val="11"/>
             <w:tabs>
@@ -1139,7 +1139,7 @@
               <w:sz w:val="28"/>
               <w:szCs w:val="28"/>
               <w:lang w:eastAsia="ru-RU"/>
-              <w14:ligatures w14:val="standardContextual"/>
+              <ns2:ligatures ns2:val="standardContextual"/>
             </w:rPr>
           </w:pPr>
           <w:hyperlink w:anchor="_Toc231405157" w:history="1">
@@ -1225,7 +1225,7 @@
             </w:r>
           </w:hyperlink>
         </w:p>
-        <w:p>
+        <w:p ns2:paraId="2566BCAC" ns2:textId="2AFADC27">
           <w:pPr>
             <w:pStyle w:val="11"/>
             <w:tabs>
@@ -1239,7 +1239,7 @@
               <w:sz w:val="28"/>
               <w:szCs w:val="28"/>
               <w:lang w:eastAsia="ru-RU"/>
-              <w14:ligatures w14:val="standardContextual"/>
+              <ns2:ligatures ns2:val="standardContextual"/>
             </w:rPr>
           </w:pPr>
           <w:hyperlink w:anchor="_Toc231405158" w:history="1">
@@ -1325,7 +1325,7 @@
             </w:r>
           </w:hyperlink>
         </w:p>
-        <w:p>
+        <w:p ns2:paraId="21AE51D2" ns2:textId="7160D05F">
           <w:pPr>
             <w:spacing w:line="360" w:lineRule="auto"/>
           </w:pPr>
@@ -1342,7 +1342,7 @@
         </w:p>
       </w:sdtContent>
     </w:sdt>
-    <w:p>
+    <w:p ns2:paraId="594E2A85" ns2:textId="77777777">
       <w:pPr>
         <w:spacing w:after="160" w:line="259" w:lineRule="auto"/>
         <w:rPr>
@@ -1361,7 +1361,7 @@
         <w:br w:type="page"/>
       </w:r>
     </w:p>
-    <w:p>
+    <w:p ns2:paraId="0959CD44" ns2:textId="224F5A76">
       <w:pPr>
         <w:pStyle w:val="1"/>
         <w:jc w:val="center"/>
@@ -1387,7 +1387,7 @@
       <w:bookmarkEnd w:id="1"/>
       <w:proofErr w:type="spellEnd"/>
     </w:p>
-    <w:p>
+    <w:p ns2:paraId="5552188A" ns2:textId="69E3B597">
       <w:pPr>
         <w:spacing w:after="0" w:line="360" w:lineRule="auto"/>
         <w:ind w:firstLine="709"/>
@@ -1449,7 +1449,7 @@
         <w:t>.</w:t>
       </w:r>
     </w:p>
-    <w:p>
+    <w:p ns2:paraId="52034B60" ns2:textId="77777777">
       <w:pPr>
         <w:spacing w:after="0" w:line="360" w:lineRule="auto"/>
         <w:ind w:firstLine="709"/>
@@ -1487,7 +1487,7 @@
         <w:t xml:space="preserve"> структуры используются при проектировании компьютерных сетей, транспортных маршрутов, систем навигации, логистических схем и многих других задач. Одной из наиболее распространённых задач является поиск оптимальной структуры связей между вершинами графа.</w:t>
       </w:r>
     </w:p>
-    <w:p>
+    <w:p ns2:paraId="636F7A5D" ns2:textId="77777777">
       <w:pPr>
         <w:spacing w:after="0" w:line="360" w:lineRule="auto"/>
         <w:ind w:firstLine="709"/>
@@ -1524,7 +1524,7 @@
         <w:t>++, которое позволяет создавать граф по заданным координатам вершин, вычислять расстояния между ними и строить дерево связей с использованием алгоритма Прима.</w:t>
       </w:r>
     </w:p>
-    <w:p>
+    <w:p ns2:paraId="46B62F7B" ns2:textId="77777777">
       <w:pPr>
         <w:spacing w:after="0" w:line="360" w:lineRule="auto"/>
         <w:ind w:firstLine="709"/>
@@ -1544,7 +1544,7 @@
         <w:t>Для достижения поставленной цели были решены следующие задачи:</w:t>
       </w:r>
     </w:p>
-    <w:p>
+    <w:p ns2:paraId="56485886" ns2:textId="77777777">
       <w:pPr>
         <w:spacing w:after="0" w:line="360" w:lineRule="auto"/>
         <w:jc w:val="both"/>
@@ -1563,7 +1563,7 @@
         <w:t>реализовано хранение координат вершин графа;</w:t>
       </w:r>
     </w:p>
-    <w:p>
+    <w:p ns2:paraId="3078FA87" ns2:textId="77777777">
       <w:pPr>
         <w:spacing w:after="0" w:line="360" w:lineRule="auto"/>
         <w:jc w:val="both"/>
@@ -1582,7 +1582,7 @@
         <w:t>разработан механизм вычисления матрицы расстояний;</w:t>
       </w:r>
     </w:p>
-    <w:p>
+    <w:p ns2:paraId="2C2FCB76" ns2:textId="77777777">
       <w:pPr>
         <w:spacing w:after="0" w:line="360" w:lineRule="auto"/>
         <w:jc w:val="both"/>
@@ -1619,7 +1619,7 @@
         <w:t xml:space="preserve"> дерева;</w:t>
       </w:r>
     </w:p>
-    <w:p>
+    <w:p ns2:paraId="409D2D1B" ns2:textId="77777777">
       <w:pPr>
         <w:spacing w:after="0" w:line="360" w:lineRule="auto"/>
         <w:jc w:val="both"/>
@@ -1672,7 +1672,7 @@
         <w:t>;</w:t>
       </w:r>
     </w:p>
-    <w:p>
+    <w:p ns2:paraId="68D84A56" ns2:textId="77777777">
       <w:pPr>
         <w:spacing w:after="0" w:line="360" w:lineRule="auto"/>
         <w:jc w:val="both"/>
@@ -1691,7 +1691,7 @@
         <w:t>обеспечено визуальное отображение полученного дерева.</w:t>
       </w:r>
     </w:p>
-    <w:p>
+    <w:p ns2:paraId="49845254" ns2:textId="3642D9FF">
       <w:pPr>
         <w:spacing w:after="0" w:line="360" w:lineRule="auto"/>
         <w:ind w:firstLine="709"/>
@@ -1711,7 +1711,7 @@
         <w:br w:type="page"/>
       </w:r>
     </w:p>
-    <w:p>
+    <w:p ns2:paraId="4523FAA3" ns2:textId="77777777">
       <w:pPr>
         <w:pStyle w:val="1"/>
         <w:jc w:val="center"/>
@@ -1735,7 +1735,7 @@
       </w:r>
       <w:bookmarkEnd w:id="2"/>
     </w:p>
-    <w:p>
+    <w:p ns2:paraId="10530F2B" ns2:textId="77777777">
       <w:pPr>
         <w:spacing w:after="0" w:line="360" w:lineRule="auto"/>
         <w:ind w:firstLine="709"/>
@@ -1756,7 +1756,7 @@
         <w:t>Графы</w:t>
       </w:r>
     </w:p>
-    <w:p>
+    <w:p ns2:paraId="5D7990D4" ns2:textId="77777777">
       <w:pPr>
         <w:spacing w:after="0" w:line="360" w:lineRule="auto"/>
         <w:ind w:firstLine="709"/>
@@ -1776,7 +1776,7 @@
         <w:t>Граф представляет собой математическую структуру, состоящую из множества вершин и соединяющих их рёбер.</w:t>
       </w:r>
     </w:p>
-    <w:p>
+    <w:p ns2:paraId="1BB5F54D" ns2:textId="77777777">
       <w:pPr>
         <w:spacing w:after="0" w:line="360" w:lineRule="auto"/>
         <w:ind w:firstLine="709"/>
@@ -1796,7 +1796,7 @@
         <w:t>Граф можно представить в виде:</w:t>
       </w:r>
     </w:p>
-    <w:p>
+    <w:p ns2:paraId="2E904E1C" ns2:textId="77777777">
       <w:pPr>
         <w:spacing w:after="0" w:line="360" w:lineRule="auto"/>
         <w:ind w:firstLine="709"/>
@@ -1816,7 +1816,7 @@
         <w:t>G = (V, E),</w:t>
       </w:r>
     </w:p>
-    <w:p>
+    <w:p ns2:paraId="7111586B" ns2:textId="77777777">
       <w:pPr>
         <w:spacing w:after="0" w:line="360" w:lineRule="auto"/>
         <w:ind w:firstLine="709"/>
@@ -1846,7 +1846,7 @@
         <w:t>:</w:t>
       </w:r>
     </w:p>
-    <w:p>
+    <w:p ns2:paraId="4179EF51" ns2:textId="77777777">
       <w:pPr>
         <w:spacing w:after="0" w:line="360" w:lineRule="auto"/>
         <w:ind w:firstLine="709"/>
@@ -1902,7 +1902,7 @@
         <w:t>;</w:t>
       </w:r>
     </w:p>
-    <w:p>
+    <w:p ns2:paraId="7DDEC65F" ns2:textId="77777777">
       <w:pPr>
         <w:spacing w:after="0" w:line="360" w:lineRule="auto"/>
         <w:ind w:firstLine="709"/>
@@ -1958,7 +1958,7 @@
         <w:t>.</w:t>
       </w:r>
     </w:p>
-    <w:p>
+    <w:p ns2:paraId="666D2372" ns2:textId="77777777">
       <w:pPr>
         <w:spacing w:after="0" w:line="360" w:lineRule="auto"/>
         <w:ind w:firstLine="709"/>
@@ -1978,7 +1978,7 @@
         <w:t>В данной работе каждая вершина задаётся координатами на плоскости.</w:t>
       </w:r>
     </w:p>
-    <w:p>
+    <w:p ns2:paraId="03F5ACDA" ns2:textId="7A365C27">
       <w:pPr>
         <w:spacing w:after="0" w:line="360" w:lineRule="auto"/>
         <w:ind w:firstLine="709"/>
@@ -1990,7 +1990,7 @@
         </w:rPr>
       </w:pPr>
     </w:p>
-    <w:p>
+    <w:p ns2:paraId="02F4D1E9" ns2:textId="77777777">
       <w:pPr>
         <w:spacing w:after="0" w:line="360" w:lineRule="auto"/>
         <w:ind w:firstLine="709"/>
@@ -2012,7 +2012,7 @@
         <w:t>Евклидово расстояние</w:t>
       </w:r>
     </w:p>
-    <w:p>
+    <w:p ns2:paraId="0525794B" ns2:textId="77777777">
       <w:pPr>
         <w:spacing w:after="0" w:line="360" w:lineRule="auto"/>
         <w:ind w:firstLine="709"/>
@@ -2032,7 +2032,7 @@
         <w:t>Для определения длины ребра между двумя вершинами используется формула евклидова расстояния:</w:t>
       </w:r>
     </w:p>
-    <w:p>
+    <w:p ns2:paraId="09AAD4B8" ns2:textId="77777777">
       <w:pPr>
         <w:spacing w:after="0" w:line="360" w:lineRule="auto"/>
         <w:ind w:firstLine="709"/>
@@ -2087,7 +2087,7 @@
         <w:t>2}”}}</w:t>
       </w:r>
     </w:p>
-    <w:p>
+    <w:p ns2:paraId="79AF503A" ns2:textId="77777777">
       <w:pPr>
         <w:spacing w:after="0" w:line="360" w:lineRule="auto"/>
         <w:ind w:firstLine="709"/>
@@ -2117,7 +2117,7 @@
         <w:t>:</w:t>
       </w:r>
     </w:p>
-    <w:p>
+    <w:p ns2:paraId="55A5B742" ns2:textId="77777777">
       <w:pPr>
         <w:spacing w:after="0" w:line="360" w:lineRule="auto"/>
         <w:ind w:firstLine="709"/>
@@ -2137,7 +2137,7 @@
         <w:t>x₁, y₁ — координаты первой вершины;</w:t>
       </w:r>
     </w:p>
-    <w:p>
+    <w:p ns2:paraId="51745164" ns2:textId="77777777">
       <w:pPr>
         <w:spacing w:after="0" w:line="360" w:lineRule="auto"/>
         <w:ind w:firstLine="709"/>
@@ -2157,7 +2157,7 @@
         <w:t>x₂, y₂ — координаты второй вершины.</w:t>
       </w:r>
     </w:p>
-    <w:p>
+    <w:p ns2:paraId="7663512D" ns2:textId="77777777">
       <w:pPr>
         <w:spacing w:after="0" w:line="360" w:lineRule="auto"/>
         <w:ind w:firstLine="709"/>
@@ -2177,7 +2177,7 @@
         <w:t>Полученные расстояния используются для формирования матрицы смежности графа.</w:t>
       </w:r>
     </w:p>
-    <w:p>
+    <w:p ns2:paraId="5B2E221C" ns2:textId="1B678B2A">
       <w:pPr>
         <w:spacing w:after="160" w:line="259" w:lineRule="auto"/>
         <w:rPr>
@@ -2196,7 +2196,7 @@
       </w:r>
     </w:p>
     <w:bookmarkEnd w:id="4"/>
-    <w:p>
+    <w:p ns2:paraId="13DF6244" ns2:textId="77777777">
       <w:pPr>
         <w:spacing w:after="0" w:line="360" w:lineRule="auto"/>
         <w:ind w:firstLine="709"/>
@@ -2217,7 +2217,7 @@
         <w:t>Алгоритм Прима</w:t>
       </w:r>
     </w:p>
-    <w:p>
+    <w:p ns2:paraId="7BC9993A" ns2:textId="77777777">
       <w:pPr>
         <w:spacing w:after="0" w:line="360" w:lineRule="auto"/>
         <w:ind w:firstLine="709"/>
@@ -2255,7 +2255,7 @@
         <w:t xml:space="preserve"> дерева связного взвешенного графа.</w:t>
       </w:r>
     </w:p>
-    <w:p>
+    <w:p ns2:paraId="00082DB3" ns2:textId="77777777">
       <w:pPr>
         <w:spacing w:after="0" w:line="360" w:lineRule="auto"/>
         <w:ind w:firstLine="709"/>
@@ -2275,7 +2275,7 @@
         <w:t>Основная идея алгоритма заключается в последовательном добавлении рёбер минимальной длины, соединяющих уже построенную часть дерева с новой вершиной.</w:t>
       </w:r>
     </w:p>
-    <w:p>
+    <w:p ns2:paraId="7E682A20" ns2:textId="77777777">
       <w:pPr>
         <w:spacing w:after="0" w:line="360" w:lineRule="auto"/>
         <w:ind w:firstLine="709"/>
@@ -2287,7 +2287,7 @@
         </w:rPr>
       </w:pPr>
     </w:p>
-    <w:p>
+    <w:p ns2:paraId="54CDE798" ns2:textId="77777777">
       <w:pPr>
         <w:spacing w:after="0" w:line="360" w:lineRule="auto"/>
         <w:ind w:firstLine="709"/>
@@ -2353,7 +2353,7 @@
         <w:t>:</w:t>
       </w:r>
     </w:p>
-    <w:p>
+    <w:p ns2:paraId="06C53BA5" ns2:textId="77777777">
       <w:pPr>
         <w:spacing w:after="0" w:line="360" w:lineRule="auto"/>
         <w:ind w:firstLine="709"/>
@@ -2391,7 +2391,7 @@
         <w:t>например, элемент g-го столбца).</w:t>
       </w:r>
     </w:p>
-    <w:p>
+    <w:p ns2:paraId="578DCB7B" ns2:textId="77777777">
       <w:pPr>
         <w:spacing w:after="0" w:line="360" w:lineRule="auto"/>
         <w:ind w:firstLine="709"/>
@@ -2410,7 +2410,7 @@
         </w:rPr>
         <w:t>2.Исключаются из рассмотрения 1-й и g-й столбцы и строится </w:t>
       </w:r>
-      <w:hyperlink r:id="rId5" w:anchor="ребро" w:history="1">
+      <w:hyperlink ns3:id="rId5" w:anchor="ребро" w:history="1">
         <w:r>
           <w:rPr>
             <w:rStyle w:val="a7"/>
@@ -2432,7 +2432,7 @@
         <w:t>, соединяющее 1-ю и g-ю вершины.</w:t>
       </w:r>
     </w:p>
-    <w:p>
+    <w:p ns2:paraId="75C423C5" ns2:textId="77777777">
       <w:pPr>
         <w:spacing w:after="0" w:line="360" w:lineRule="auto"/>
         <w:ind w:firstLine="709"/>
@@ -2472,7 +2472,7 @@
         <w:t xml:space="preserve"> выбирается любой из них).</w:t>
       </w:r>
     </w:p>
-    <w:p>
+    <w:p ns2:paraId="009D209A" ns2:textId="77777777">
       <w:pPr>
         <w:spacing w:after="0" w:line="360" w:lineRule="auto"/>
         <w:ind w:firstLine="709"/>
@@ -2712,7 +2712,7 @@
         <w:t>. 3 и 4.</w:t>
       </w:r>
     </w:p>
-    <w:p>
+    <w:p ns2:paraId="26F853F1" ns2:textId="77777777">
       <w:pPr>
         <w:spacing w:after="0" w:line="360" w:lineRule="auto"/>
         <w:ind w:firstLine="709"/>
@@ -2780,7 +2780,7 @@
         <w:t xml:space="preserve"> ищется новый минимум.</w:t>
       </w:r>
     </w:p>
-    <w:p>
+    <w:p ns2:paraId="1FB90D89" ns2:textId="77777777">
       <w:pPr>
         <w:spacing w:after="0" w:line="360" w:lineRule="auto"/>
         <w:ind w:firstLine="709"/>
@@ -2820,7 +2820,7 @@
         <w:t xml:space="preserve"> не будут включены все строки.</w:t>
       </w:r>
     </w:p>
-    <w:p>
+    <w:p ns2:paraId="003A6E06" ns2:textId="77777777">
       <w:pPr>
         <w:spacing w:after="0" w:line="360" w:lineRule="auto"/>
         <w:ind w:firstLine="709"/>
@@ -2858,7 +2858,7 @@
         <w:t xml:space="preserve"> дерево, содержащее все вершины графа и минимальную суммарную длину рёбер.</w:t>
       </w:r>
     </w:p>
-    <w:p>
+    <w:p ns2:paraId="5758CC67" ns2:textId="77777777">
       <w:pPr>
         <w:spacing w:after="160" w:line="259" w:lineRule="auto"/>
         <w:rPr>
@@ -2876,7 +2876,7 @@
         <w:br w:type="page"/>
       </w:r>
     </w:p>
-    <w:p>
+    <w:p ns2:paraId="737175B1" ns2:textId="77777777">
       <w:pPr>
         <w:spacing w:after="0" w:line="360" w:lineRule="auto"/>
         <w:ind w:firstLine="709"/>
@@ -2901,7 +2901,7 @@
         <w:t>Схема алгоритма Прима:</w:t>
       </w:r>
     </w:p>
-    <w:p>
+    <w:p ns2:paraId="1C7B3615" ns2:textId="5A1609AE">
       <w:pPr>
         <w:spacing w:after="0" w:line="240" w:lineRule="auto"/>
         <w:jc w:val="center"/>
@@ -2921,56 +2921,56 @@
           <w:lang w:eastAsia="ru-RU"/>
         </w:rPr>
         <w:drawing>
-          <wp:inline distT="0" distB="0" distL="0" distR="0" wp14:anchorId="37CBB212" wp14:editId="61AEFBAE">
-            <wp:extent cx="1989440" cy="8800743"/>
-            <wp:effectExtent l="0" t="0" r="0" b="0"/>
-            <wp:docPr id="176931601" name="Рисунок 3"/>
-            <wp:cNvGraphicFramePr>
-              <a:graphicFrameLocks xmlns:a="http://schemas.openxmlformats.org/drawingml/2006/main" noChangeAspect="1"/>
-            </wp:cNvGraphicFramePr>
-            <a:graphic xmlns:a="http://schemas.openxmlformats.org/drawingml/2006/main">
-              <a:graphicData uri="http://schemas.openxmlformats.org/drawingml/2006/picture">
-                <pic:pic xmlns:pic="http://schemas.openxmlformats.org/drawingml/2006/picture">
-                  <pic:nvPicPr>
-                    <pic:cNvPr id="0" name="Picture 511"/>
-                    <pic:cNvPicPr>
-                      <a:picLocks noChangeAspect="1" noChangeArrowheads="1"/>
-                    </pic:cNvPicPr>
-                  </pic:nvPicPr>
-                  <pic:blipFill>
-                    <a:blip r:embed="rId6" cstate="print">
-                      <a:extLst>
-                        <a:ext uri="{28A0092B-C50C-407E-A947-70E740481C1C}">
-                          <a14:useLocalDpi xmlns:a14="http://schemas.microsoft.com/office/drawing/2010/main" val="0"/>
-                        </a:ext>
-                      </a:extLst>
-                    </a:blip>
-                    <a:srcRect/>
-                    <a:stretch>
-                      <a:fillRect/>
-                    </a:stretch>
-                  </pic:blipFill>
-                  <pic:spPr bwMode="auto">
-                    <a:xfrm>
-                      <a:off x="0" y="0"/>
-                      <a:ext cx="2000097" cy="8847888"/>
-                    </a:xfrm>
-                    <a:prstGeom prst="rect">
-                      <a:avLst/>
-                    </a:prstGeom>
-                    <a:noFill/>
-                    <a:ln>
-                      <a:noFill/>
-                    </a:ln>
-                  </pic:spPr>
-                </pic:pic>
-              </a:graphicData>
-            </a:graphic>
-          </wp:inline>
+          <ns4:inline distT="0" distB="0" distL="0" distR="0" ns5:anchorId="37CBB212" ns5:editId="61AEFBAE">
+            <ns4:extent cx="1989440" cy="8800743"/>
+            <ns4:effectExtent l="0" t="0" r="0" b="0"/>
+            <ns4:docPr id="176931601" name="Рисунок 3"/>
+            <ns4:cNvGraphicFramePr>
+              <ns6:graphicFrameLocks noChangeAspect="1"/>
+            </ns4:cNvGraphicFramePr>
+            <ns6:graphic>
+              <ns6:graphicData uri="http://schemas.openxmlformats.org/drawingml/2006/picture">
+                <ns7:pic>
+                  <ns7:nvPicPr>
+                    <ns7:cNvPr id="0" name="Picture 511"/>
+                    <ns7:cNvPicPr>
+                      <ns6:picLocks noChangeAspect="1" noChangeArrowheads="1"/>
+                    </ns7:cNvPicPr>
+                  </ns7:nvPicPr>
+                  <ns7:blipFill>
+                    <ns6:blip ns3:embed="rId6" cstate="print">
+                      <ns6:extLst>
+                        <ns6:ext uri="{28A0092B-C50C-407E-A947-70E740481C1C}">
+                          <ns8:useLocalDpi val="0"/>
+                        </ns6:ext>
+                      </ns6:extLst>
+                    </ns6:blip>
+                    <ns6:srcRect/>
+                    <ns6:stretch>
+                      <ns6:fillRect/>
+                    </ns6:stretch>
+                  </ns7:blipFill>
+                  <ns7:spPr bwMode="auto">
+                    <ns6:xfrm>
+                      <ns6:off x="0" y="0"/>
+                      <ns6:ext cx="2000097" cy="8847888"/>
+                    </ns6:xfrm>
+                    <ns6:prstGeom prst="rect">
+                      <ns6:avLst/>
+                    </ns6:prstGeom>
+                    <ns6:noFill/>
+                    <ns6:ln>
+                      <ns6:noFill/>
+                    </ns6:ln>
+                  </ns7:spPr>
+                </ns7:pic>
+              </ns6:graphicData>
+            </ns6:graphic>
+          </ns4:inline>
         </w:drawing>
       </w:r>
     </w:p>
-    <w:p>
+    <w:p ns2:paraId="2CAAAE04" ns2:textId="643F0BA7">
       <w:pPr>
         <w:spacing w:after="0" w:line="360" w:lineRule="auto"/>
         <w:jc w:val="both"/>
@@ -3002,7 +3002,7 @@
       </w:r>
       <w:bookmarkEnd w:id="5"/>
     </w:p>
-    <w:p>
+    <w:p ns2:paraId="3DB1D631" ns2:textId="172CCC6A">
       <w:pPr>
         <w:pStyle w:val="1"/>
         <w:rPr>
@@ -3036,7 +3036,7 @@
       </w:r>
       <w:bookmarkEnd w:id="6"/>
     </w:p>
-    <w:p>
+    <w:p ns2:paraId="28784820" ns2:textId="70BA9E68">
       <w:pPr>
         <w:spacing w:after="0" w:line="360" w:lineRule="auto"/>
         <w:ind w:firstLine="709"/>
@@ -3054,47 +3054,47 @@
           <w:szCs w:val="28"/>
         </w:rPr>
         <w:drawing>
-          <wp:anchor distT="0" distB="0" distL="114300" distR="114300" simplePos="0" relativeHeight="251659264" behindDoc="0" locked="0" layoutInCell="1" allowOverlap="1" wp14:anchorId="42725A60" wp14:editId="41F27D62">
-            <wp:simplePos x="0" y="0"/>
-            <wp:positionH relativeFrom="column">
-              <wp:posOffset>9525</wp:posOffset>
-            </wp:positionH>
-            <wp:positionV relativeFrom="paragraph">
-              <wp:posOffset>371475</wp:posOffset>
-            </wp:positionV>
-            <wp:extent cx="5940425" cy="384810"/>
-            <wp:effectExtent l="0" t="0" r="3175" b="0"/>
-            <wp:wrapTopAndBottom/>
-            <wp:docPr id="1072683908" name="Рисунок 1"/>
-            <wp:cNvGraphicFramePr>
-              <a:graphicFrameLocks xmlns:a="http://schemas.openxmlformats.org/drawingml/2006/main" noChangeAspect="1"/>
-            </wp:cNvGraphicFramePr>
-            <a:graphic xmlns:a="http://schemas.openxmlformats.org/drawingml/2006/main">
-              <a:graphicData uri="http://schemas.openxmlformats.org/drawingml/2006/picture">
-                <pic:pic xmlns:pic="http://schemas.openxmlformats.org/drawingml/2006/picture">
-                  <pic:nvPicPr>
-                    <pic:cNvPr id="1072683908" name=""/>
-                    <pic:cNvPicPr/>
-                  </pic:nvPicPr>
-                  <pic:blipFill>
-                    <a:blip r:embed="rId7"/>
-                    <a:stretch>
-                      <a:fillRect/>
-                    </a:stretch>
-                  </pic:blipFill>
-                  <pic:spPr>
-                    <a:xfrm>
-                      <a:off x="0" y="0"/>
-                      <a:ext cx="5940425" cy="384810"/>
-                    </a:xfrm>
-                    <a:prstGeom prst="rect">
-                      <a:avLst/>
-                    </a:prstGeom>
-                  </pic:spPr>
-                </pic:pic>
-              </a:graphicData>
-            </a:graphic>
-          </wp:anchor>
+          <ns4:anchor distT="0" distB="0" distL="114300" distR="114300" simplePos="0" relativeHeight="251659264" behindDoc="0" locked="0" layoutInCell="1" allowOverlap="1" ns5:anchorId="42725A60" ns5:editId="41F27D62">
+            <ns4:simplePos x="0" y="0"/>
+            <ns4:positionH relativeFrom="column">
+              <ns4:posOffset>9525</ns4:posOffset>
+            </ns4:positionH>
+            <ns4:positionV relativeFrom="paragraph">
+              <ns4:posOffset>371475</ns4:posOffset>
+            </ns4:positionV>
+            <ns4:extent cx="5940425" cy="384810"/>
+            <ns4:effectExtent l="0" t="0" r="3175" b="0"/>
+            <ns4:wrapTopAndBottom/>
+            <ns4:docPr id="1072683908" name="Рисунок 1"/>
+            <ns4:cNvGraphicFramePr>
+              <ns6:graphicFrameLocks noChangeAspect="1"/>
+            </ns4:cNvGraphicFramePr>
+            <ns6:graphic>
+              <ns6:graphicData uri="http://schemas.openxmlformats.org/drawingml/2006/picture">
+                <ns7:pic>
+                  <ns7:nvPicPr>
+                    <ns7:cNvPr id="1072683908" name=""/>
+                    <ns7:cNvPicPr/>
+                  </ns7:nvPicPr>
+                  <ns7:blipFill>
+                    <ns6:blip ns3:embed="rId7"/>
+                    <ns6:stretch>
+                      <ns6:fillRect/>
+                    </ns6:stretch>
+                  </ns7:blipFill>
+                  <ns7:spPr>
+                    <ns6:xfrm>
+                      <ns6:off x="0" y="0"/>
+                      <ns6:ext cx="5940425" cy="384810"/>
+                    </ns6:xfrm>
+                    <ns6:prstGeom prst="rect">
+                      <ns6:avLst/>
+                    </ns6:prstGeom>
+                  </ns7:spPr>
+                </ns7:pic>
+              </ns6:graphicData>
+            </ns6:graphic>
+          </ns4:anchor>
         </w:drawing>
       </w:r>
       <w:r>
@@ -3115,7 +3115,7 @@
         <w:t>Git</w:t>
       </w:r>
     </w:p>
-    <w:p>
+    <w:p ns2:paraId="0A891E4B" ns2:textId="5FEF0C60">
       <w:pPr>
         <w:spacing w:after="0" w:line="360" w:lineRule="auto"/>
         <w:ind w:firstLine="709"/>
@@ -3127,7 +3127,7 @@
         </w:rPr>
       </w:pPr>
     </w:p>
-    <w:p>
+    <w:p ns2:paraId="21BB253F" ns2:textId="030542EF">
       <w:pPr>
         <w:spacing w:after="0" w:line="360" w:lineRule="auto"/>
         <w:ind w:firstLine="709"/>
@@ -3145,47 +3145,47 @@
           <w:szCs w:val="28"/>
         </w:rPr>
         <w:drawing>
-          <wp:anchor distT="0" distB="0" distL="114300" distR="114300" simplePos="0" relativeHeight="251661312" behindDoc="0" locked="0" layoutInCell="1" allowOverlap="1" wp14:anchorId="20D47842" wp14:editId="7E79D0D6">
-            <wp:simplePos x="0" y="0"/>
-            <wp:positionH relativeFrom="column">
-              <wp:posOffset>-19050</wp:posOffset>
-            </wp:positionH>
-            <wp:positionV relativeFrom="paragraph">
-              <wp:posOffset>335280</wp:posOffset>
-            </wp:positionV>
-            <wp:extent cx="5940425" cy="267970"/>
-            <wp:effectExtent l="0" t="0" r="3175" b="0"/>
-            <wp:wrapTopAndBottom/>
-            <wp:docPr id="46624491" name="Рисунок 1"/>
-            <wp:cNvGraphicFramePr>
-              <a:graphicFrameLocks xmlns:a="http://schemas.openxmlformats.org/drawingml/2006/main" noChangeAspect="1"/>
-            </wp:cNvGraphicFramePr>
-            <a:graphic xmlns:a="http://schemas.openxmlformats.org/drawingml/2006/main">
-              <a:graphicData uri="http://schemas.openxmlformats.org/drawingml/2006/picture">
-                <pic:pic xmlns:pic="http://schemas.openxmlformats.org/drawingml/2006/picture">
-                  <pic:nvPicPr>
-                    <pic:cNvPr id="46624491" name=""/>
-                    <pic:cNvPicPr/>
-                  </pic:nvPicPr>
-                  <pic:blipFill>
-                    <a:blip r:embed="rId8"/>
-                    <a:stretch>
-                      <a:fillRect/>
-                    </a:stretch>
-                  </pic:blipFill>
-                  <pic:spPr>
-                    <a:xfrm>
-                      <a:off x="0" y="0"/>
-                      <a:ext cx="5940425" cy="267970"/>
-                    </a:xfrm>
-                    <a:prstGeom prst="rect">
-                      <a:avLst/>
-                    </a:prstGeom>
-                  </pic:spPr>
-                </pic:pic>
-              </a:graphicData>
-            </a:graphic>
-          </wp:anchor>
+          <ns4:anchor distT="0" distB="0" distL="114300" distR="114300" simplePos="0" relativeHeight="251661312" behindDoc="0" locked="0" layoutInCell="1" allowOverlap="1" ns5:anchorId="20D47842" ns5:editId="7E79D0D6">
+            <ns4:simplePos x="0" y="0"/>
+            <ns4:positionH relativeFrom="column">
+              <ns4:posOffset>-19050</ns4:posOffset>
+            </ns4:positionH>
+            <ns4:positionV relativeFrom="paragraph">
+              <ns4:posOffset>335280</ns4:posOffset>
+            </ns4:positionV>
+            <ns4:extent cx="5940425" cy="267970"/>
+            <ns4:effectExtent l="0" t="0" r="3175" b="0"/>
+            <ns4:wrapTopAndBottom/>
+            <ns4:docPr id="46624491" name="Рисунок 1"/>
+            <ns4:cNvGraphicFramePr>
+              <ns6:graphicFrameLocks noChangeAspect="1"/>
+            </ns4:cNvGraphicFramePr>
+            <ns6:graphic>
+              <ns6:graphicData uri="http://schemas.openxmlformats.org/drawingml/2006/picture">
+                <ns7:pic>
+                  <ns7:nvPicPr>
+                    <ns7:cNvPr id="46624491" name=""/>
+                    <ns7:cNvPicPr/>
+                  </ns7:nvPicPr>
+                  <ns7:blipFill>
+                    <ns6:blip ns3:embed="rId8"/>
+                    <ns6:stretch>
+                      <ns6:fillRect/>
+                    </ns6:stretch>
+                  </ns7:blipFill>
+                  <ns7:spPr>
+                    <ns6:xfrm>
+                      <ns6:off x="0" y="0"/>
+                      <ns6:ext cx="5940425" cy="267970"/>
+                    </ns6:xfrm>
+                    <ns6:prstGeom prst="rect">
+                      <ns6:avLst/>
+                    </ns6:prstGeom>
+                  </ns7:spPr>
+                </ns7:pic>
+              </ns6:graphicData>
+            </ns6:graphic>
+          </ns4:anchor>
         </w:drawing>
       </w:r>
       <w:r>
@@ -3240,7 +3240,7 @@
         <w:t>Git</w:t>
       </w:r>
     </w:p>
-    <w:p>
+    <w:p ns2:paraId="38CEF604" ns2:textId="174D1402">
       <w:pPr>
         <w:spacing w:after="0" w:line="360" w:lineRule="auto"/>
         <w:ind w:firstLine="709"/>
@@ -3252,7 +3252,7 @@
         </w:rPr>
       </w:pPr>
     </w:p>
-    <w:p>
+    <w:p ns2:paraId="097092EA" ns2:textId="0FFCA631">
       <w:pPr>
         <w:spacing w:after="0" w:line="360" w:lineRule="auto"/>
         <w:ind w:firstLine="709"/>
@@ -3270,47 +3270,47 @@
           <w:szCs w:val="28"/>
         </w:rPr>
         <w:drawing>
-          <wp:anchor distT="0" distB="0" distL="114300" distR="114300" simplePos="0" relativeHeight="251663360" behindDoc="0" locked="0" layoutInCell="1" allowOverlap="1" wp14:anchorId="4D631977" wp14:editId="564B8B17">
-            <wp:simplePos x="0" y="0"/>
-            <wp:positionH relativeFrom="column">
-              <wp:posOffset>57150</wp:posOffset>
-            </wp:positionH>
-            <wp:positionV relativeFrom="paragraph">
-              <wp:posOffset>325755</wp:posOffset>
-            </wp:positionV>
-            <wp:extent cx="5940425" cy="2641600"/>
-            <wp:effectExtent l="0" t="0" r="3175" b="6350"/>
-            <wp:wrapTopAndBottom/>
-            <wp:docPr id="343416601" name="Рисунок 1"/>
-            <wp:cNvGraphicFramePr>
-              <a:graphicFrameLocks xmlns:a="http://schemas.openxmlformats.org/drawingml/2006/main" noChangeAspect="1"/>
-            </wp:cNvGraphicFramePr>
-            <a:graphic xmlns:a="http://schemas.openxmlformats.org/drawingml/2006/main">
-              <a:graphicData uri="http://schemas.openxmlformats.org/drawingml/2006/picture">
-                <pic:pic xmlns:pic="http://schemas.openxmlformats.org/drawingml/2006/picture">
-                  <pic:nvPicPr>
-                    <pic:cNvPr id="343416601" name=""/>
-                    <pic:cNvPicPr/>
-                  </pic:nvPicPr>
-                  <pic:blipFill>
-                    <a:blip r:embed="rId9"/>
-                    <a:stretch>
-                      <a:fillRect/>
-                    </a:stretch>
-                  </pic:blipFill>
-                  <pic:spPr>
-                    <a:xfrm>
-                      <a:off x="0" y="0"/>
-                      <a:ext cx="5940425" cy="2641600"/>
-                    </a:xfrm>
-                    <a:prstGeom prst="rect">
-                      <a:avLst/>
-                    </a:prstGeom>
-                  </pic:spPr>
-                </pic:pic>
-              </a:graphicData>
-            </a:graphic>
-          </wp:anchor>
+          <ns4:anchor distT="0" distB="0" distL="114300" distR="114300" simplePos="0" relativeHeight="251663360" behindDoc="0" locked="0" layoutInCell="1" allowOverlap="1" ns5:anchorId="4D631977" ns5:editId="564B8B17">
+            <ns4:simplePos x="0" y="0"/>
+            <ns4:positionH relativeFrom="column">
+              <ns4:posOffset>57150</ns4:posOffset>
+            </ns4:positionH>
+            <ns4:positionV relativeFrom="paragraph">
+              <ns4:posOffset>325755</ns4:posOffset>
+            </ns4:positionV>
+            <ns4:extent cx="5940425" cy="2641600"/>
+            <ns4:effectExtent l="0" t="0" r="3175" b="6350"/>
+            <ns4:wrapTopAndBottom/>
+            <ns4:docPr id="343416601" name="Рисунок 1"/>
+            <ns4:cNvGraphicFramePr>
+              <ns6:graphicFrameLocks noChangeAspect="1"/>
+            </ns4:cNvGraphicFramePr>
+            <ns6:graphic>
+              <ns6:graphicData uri="http://schemas.openxmlformats.org/drawingml/2006/picture">
+                <ns7:pic>
+                  <ns7:nvPicPr>
+                    <ns7:cNvPr id="343416601" name=""/>
+                    <ns7:cNvPicPr/>
+                  </ns7:nvPicPr>
+                  <ns7:blipFill>
+                    <ns6:blip ns3:embed="rId9"/>
+                    <ns6:stretch>
+                      <ns6:fillRect/>
+                    </ns6:stretch>
+                  </ns7:blipFill>
+                  <ns7:spPr>
+                    <ns6:xfrm>
+                      <ns6:off x="0" y="0"/>
+                      <ns6:ext cx="5940425" cy="2641600"/>
+                    </ns6:xfrm>
+                    <ns6:prstGeom prst="rect">
+                      <ns6:avLst/>
+                    </ns6:prstGeom>
+                  </ns7:spPr>
+                </ns7:pic>
+              </ns6:graphicData>
+            </ns6:graphic>
+          </ns4:anchor>
         </w:drawing>
       </w:r>
       <w:r>
@@ -3322,7 +3322,7 @@
         <w:t>Проверил статус</w:t>
       </w:r>
     </w:p>
-    <w:p>
+    <w:p ns2:paraId="21FA5BD8" ns2:textId="37D20AFF">
       <w:pPr>
         <w:spacing w:after="0" w:line="360" w:lineRule="auto"/>
         <w:ind w:firstLine="709"/>
@@ -3334,7 +3334,7 @@
         </w:rPr>
       </w:pPr>
     </w:p>
-    <w:p>
+    <w:p ns2:paraId="04081D2C" ns2:textId="77777777">
       <w:pPr>
         <w:spacing w:after="160" w:line="259" w:lineRule="auto"/>
         <w:rPr>
@@ -3352,7 +3352,7 @@
         <w:br w:type="page"/>
       </w:r>
     </w:p>
-    <w:p>
+    <w:p ns2:paraId="55E2E9A2" ns2:textId="3B46AC03">
       <w:pPr>
         <w:spacing w:after="0" w:line="360" w:lineRule="auto"/>
         <w:ind w:firstLine="709"/>
@@ -3371,53 +3371,53 @@
         </w:rPr>
         <w:lastRenderedPageBreak/>
         <w:drawing>
-          <wp:anchor distT="0" distB="0" distL="114300" distR="114300" simplePos="0" relativeHeight="251665408" behindDoc="0" locked="0" layoutInCell="1" allowOverlap="1" wp14:anchorId="7BFAF4F3" wp14:editId="57FE7EE2">
-            <wp:simplePos x="0" y="0"/>
-            <wp:positionH relativeFrom="column">
-              <wp:posOffset>313690</wp:posOffset>
-            </wp:positionH>
-            <wp:positionV relativeFrom="paragraph">
-              <wp:posOffset>287020</wp:posOffset>
-            </wp:positionV>
-            <wp:extent cx="5159375" cy="3733800"/>
-            <wp:effectExtent l="0" t="0" r="3175" b="0"/>
-            <wp:wrapTopAndBottom/>
-            <wp:docPr id="859903087" name="Рисунок 1"/>
-            <wp:cNvGraphicFramePr>
-              <a:graphicFrameLocks xmlns:a="http://schemas.openxmlformats.org/drawingml/2006/main" noChangeAspect="1"/>
-            </wp:cNvGraphicFramePr>
-            <a:graphic xmlns:a="http://schemas.openxmlformats.org/drawingml/2006/main">
-              <a:graphicData uri="http://schemas.openxmlformats.org/drawingml/2006/picture">
-                <pic:pic xmlns:pic="http://schemas.openxmlformats.org/drawingml/2006/picture">
-                  <pic:nvPicPr>
-                    <pic:cNvPr id="859903087" name=""/>
-                    <pic:cNvPicPr/>
-                  </pic:nvPicPr>
-                  <pic:blipFill>
-                    <a:blip r:embed="rId10"/>
-                    <a:stretch>
-                      <a:fillRect/>
-                    </a:stretch>
-                  </pic:blipFill>
-                  <pic:spPr>
-                    <a:xfrm>
-                      <a:off x="0" y="0"/>
-                      <a:ext cx="5159375" cy="3733800"/>
-                    </a:xfrm>
-                    <a:prstGeom prst="rect">
-                      <a:avLst/>
-                    </a:prstGeom>
-                  </pic:spPr>
-                </pic:pic>
-              </a:graphicData>
-            </a:graphic>
-            <wp14:sizeRelH relativeFrom="margin">
-              <wp14:pctWidth>0</wp14:pctWidth>
-            </wp14:sizeRelH>
-            <wp14:sizeRelV relativeFrom="margin">
-              <wp14:pctHeight>0</wp14:pctHeight>
-            </wp14:sizeRelV>
-          </wp:anchor>
+          <ns4:anchor distT="0" distB="0" distL="114300" distR="114300" simplePos="0" relativeHeight="251665408" behindDoc="0" locked="0" layoutInCell="1" allowOverlap="1" ns5:anchorId="7BFAF4F3" ns5:editId="57FE7EE2">
+            <ns4:simplePos x="0" y="0"/>
+            <ns4:positionH relativeFrom="column">
+              <ns4:posOffset>313690</ns4:posOffset>
+            </ns4:positionH>
+            <ns4:positionV relativeFrom="paragraph">
+              <ns4:posOffset>287020</ns4:posOffset>
+            </ns4:positionV>
+            <ns4:extent cx="5159375" cy="3733800"/>
+            <ns4:effectExtent l="0" t="0" r="3175" b="0"/>
+            <ns4:wrapTopAndBottom/>
+            <ns4:docPr id="859903087" name="Рисунок 1"/>
+            <ns4:cNvGraphicFramePr>
+              <ns6:graphicFrameLocks noChangeAspect="1"/>
+            </ns4:cNvGraphicFramePr>
+            <ns6:graphic>
+              <ns6:graphicData uri="http://schemas.openxmlformats.org/drawingml/2006/picture">
+                <ns7:pic>
+                  <ns7:nvPicPr>
+                    <ns7:cNvPr id="859903087" name=""/>
+                    <ns7:cNvPicPr/>
+                  </ns7:nvPicPr>
+                  <ns7:blipFill>
+                    <ns6:blip ns3:embed="rId10"/>
+                    <ns6:stretch>
+                      <ns6:fillRect/>
+                    </ns6:stretch>
+                  </ns7:blipFill>
+                  <ns7:spPr>
+                    <ns6:xfrm>
+                      <ns6:off x="0" y="0"/>
+                      <ns6:ext cx="5159375" cy="3733800"/>
+                    </ns6:xfrm>
+                    <ns6:prstGeom prst="rect">
+                      <ns6:avLst/>
+                    </ns6:prstGeom>
+                  </ns7:spPr>
+                </ns7:pic>
+              </ns6:graphicData>
+            </ns6:graphic>
+            <ns5:sizeRelH relativeFrom="margin">
+              <ns5:pctWidth>0</ns5:pctWidth>
+            </ns5:sizeRelH>
+            <ns5:sizeRelV relativeFrom="margin">
+              <ns5:pctHeight>0</ns5:pctHeight>
+            </ns5:sizeRelV>
+          </ns4:anchor>
         </w:drawing>
       </w:r>
       <w:r>
@@ -3450,7 +3450,7 @@
       <w:proofErr w:type="spellEnd"/>
       <w:proofErr w:type="gramEnd"/>
     </w:p>
-    <w:p>
+    <w:p ns2:paraId="42641DB5" ns2:textId="1056A22A">
       <w:pPr>
         <w:spacing w:after="0" w:line="360" w:lineRule="auto"/>
         <w:ind w:firstLine="709"/>
@@ -3462,7 +3462,7 @@
         </w:rPr>
       </w:pPr>
     </w:p>
-    <w:p>
+    <w:p ns2:paraId="2F420BF6" ns2:textId="429A3F36">
       <w:pPr>
         <w:spacing w:after="0" w:line="360" w:lineRule="auto"/>
         <w:ind w:firstLine="709"/>
@@ -3480,47 +3480,47 @@
           <w:szCs w:val="28"/>
         </w:rPr>
         <w:drawing>
-          <wp:anchor distT="0" distB="0" distL="114300" distR="114300" simplePos="0" relativeHeight="251667456" behindDoc="0" locked="0" layoutInCell="1" allowOverlap="1" wp14:anchorId="769E2B63" wp14:editId="3C578492">
-            <wp:simplePos x="0" y="0"/>
-            <wp:positionH relativeFrom="column">
-              <wp:posOffset>152400</wp:posOffset>
-            </wp:positionH>
-            <wp:positionV relativeFrom="paragraph">
-              <wp:posOffset>582295</wp:posOffset>
-            </wp:positionV>
-            <wp:extent cx="5940425" cy="454025"/>
-            <wp:effectExtent l="0" t="0" r="3175" b="3175"/>
-            <wp:wrapTopAndBottom/>
-            <wp:docPr id="1485010438" name="Рисунок 1"/>
-            <wp:cNvGraphicFramePr>
-              <a:graphicFrameLocks xmlns:a="http://schemas.openxmlformats.org/drawingml/2006/main" noChangeAspect="1"/>
-            </wp:cNvGraphicFramePr>
-            <a:graphic xmlns:a="http://schemas.openxmlformats.org/drawingml/2006/main">
-              <a:graphicData uri="http://schemas.openxmlformats.org/drawingml/2006/picture">
-                <pic:pic xmlns:pic="http://schemas.openxmlformats.org/drawingml/2006/picture">
-                  <pic:nvPicPr>
-                    <pic:cNvPr id="1485010438" name=""/>
-                    <pic:cNvPicPr/>
-                  </pic:nvPicPr>
-                  <pic:blipFill>
-                    <a:blip r:embed="rId11"/>
-                    <a:stretch>
-                      <a:fillRect/>
-                    </a:stretch>
-                  </pic:blipFill>
-                  <pic:spPr>
-                    <a:xfrm>
-                      <a:off x="0" y="0"/>
-                      <a:ext cx="5940425" cy="454025"/>
-                    </a:xfrm>
-                    <a:prstGeom prst="rect">
-                      <a:avLst/>
-                    </a:prstGeom>
-                  </pic:spPr>
-                </pic:pic>
-              </a:graphicData>
-            </a:graphic>
-          </wp:anchor>
+          <ns4:anchor distT="0" distB="0" distL="114300" distR="114300" simplePos="0" relativeHeight="251667456" behindDoc="0" locked="0" layoutInCell="1" allowOverlap="1" ns5:anchorId="769E2B63" ns5:editId="3C578492">
+            <ns4:simplePos x="0" y="0"/>
+            <ns4:positionH relativeFrom="column">
+              <ns4:posOffset>152400</ns4:posOffset>
+            </ns4:positionH>
+            <ns4:positionV relativeFrom="paragraph">
+              <ns4:posOffset>582295</ns4:posOffset>
+            </ns4:positionV>
+            <ns4:extent cx="5940425" cy="454025"/>
+            <ns4:effectExtent l="0" t="0" r="3175" b="3175"/>
+            <ns4:wrapTopAndBottom/>
+            <ns4:docPr id="1485010438" name="Рисунок 1"/>
+            <ns4:cNvGraphicFramePr>
+              <ns6:graphicFrameLocks noChangeAspect="1"/>
+            </ns4:cNvGraphicFramePr>
+            <ns6:graphic>
+              <ns6:graphicData uri="http://schemas.openxmlformats.org/drawingml/2006/picture">
+                <ns7:pic>
+                  <ns7:nvPicPr>
+                    <ns7:cNvPr id="1485010438" name=""/>
+                    <ns7:cNvPicPr/>
+                  </ns7:nvPicPr>
+                  <ns7:blipFill>
+                    <ns6:blip ns3:embed="rId11"/>
+                    <ns6:stretch>
+                      <ns6:fillRect/>
+                    </ns6:stretch>
+                  </ns7:blipFill>
+                  <ns7:spPr>
+                    <ns6:xfrm>
+                      <ns6:off x="0" y="0"/>
+                      <ns6:ext cx="5940425" cy="454025"/>
+                    </ns6:xfrm>
+                    <ns6:prstGeom prst="rect">
+                      <ns6:avLst/>
+                    </ns6:prstGeom>
+                  </ns7:spPr>
+                </ns7:pic>
+              </ns6:graphicData>
+            </ns6:graphic>
+          </ns4:anchor>
         </w:drawing>
       </w:r>
       <w:r>
@@ -3549,7 +3549,7 @@
         <w:t>master</w:t>
       </w:r>
     </w:p>
-    <w:p>
+    <w:p ns2:paraId="58C88F08" ns2:textId="44FB7641">
       <w:pPr>
         <w:spacing w:after="0" w:line="360" w:lineRule="auto"/>
         <w:ind w:firstLine="709"/>
@@ -3561,7 +3561,7 @@
         </w:rPr>
       </w:pPr>
     </w:p>
-    <w:p>
+    <w:p ns2:paraId="0D9A9AB2" ns2:textId="1BA1E3F3">
       <w:pPr>
         <w:spacing w:after="0" w:line="360" w:lineRule="auto"/>
         <w:ind w:firstLine="709"/>
@@ -3579,53 +3579,53 @@
           <w:szCs w:val="28"/>
         </w:rPr>
         <w:drawing>
-          <wp:anchor distT="0" distB="0" distL="114300" distR="114300" simplePos="0" relativeHeight="251669504" behindDoc="0" locked="0" layoutInCell="1" allowOverlap="1" wp14:anchorId="6FC6D5A9" wp14:editId="14A0CBC4">
-            <wp:simplePos x="0" y="0"/>
-            <wp:positionH relativeFrom="column">
-              <wp:posOffset>320040</wp:posOffset>
-            </wp:positionH>
-            <wp:positionV relativeFrom="paragraph">
-              <wp:posOffset>284480</wp:posOffset>
-            </wp:positionV>
-            <wp:extent cx="5092700" cy="3048000"/>
-            <wp:effectExtent l="0" t="0" r="0" b="0"/>
-            <wp:wrapTopAndBottom/>
-            <wp:docPr id="1349100464" name="Рисунок 1"/>
-            <wp:cNvGraphicFramePr>
-              <a:graphicFrameLocks xmlns:a="http://schemas.openxmlformats.org/drawingml/2006/main" noChangeAspect="1"/>
-            </wp:cNvGraphicFramePr>
-            <a:graphic xmlns:a="http://schemas.openxmlformats.org/drawingml/2006/main">
-              <a:graphicData uri="http://schemas.openxmlformats.org/drawingml/2006/picture">
-                <pic:pic xmlns:pic="http://schemas.openxmlformats.org/drawingml/2006/picture">
-                  <pic:nvPicPr>
-                    <pic:cNvPr id="1349100464" name=""/>
-                    <pic:cNvPicPr/>
-                  </pic:nvPicPr>
-                  <pic:blipFill>
-                    <a:blip r:embed="rId12"/>
-                    <a:stretch>
-                      <a:fillRect/>
-                    </a:stretch>
-                  </pic:blipFill>
-                  <pic:spPr>
-                    <a:xfrm>
-                      <a:off x="0" y="0"/>
-                      <a:ext cx="5092700" cy="3048000"/>
-                    </a:xfrm>
-                    <a:prstGeom prst="rect">
-                      <a:avLst/>
-                    </a:prstGeom>
-                  </pic:spPr>
-                </pic:pic>
-              </a:graphicData>
-            </a:graphic>
-            <wp14:sizeRelH relativeFrom="margin">
-              <wp14:pctWidth>0</wp14:pctWidth>
-            </wp14:sizeRelH>
-            <wp14:sizeRelV relativeFrom="margin">
-              <wp14:pctHeight>0</wp14:pctHeight>
-            </wp14:sizeRelV>
-          </wp:anchor>
+          <ns4:anchor distT="0" distB="0" distL="114300" distR="114300" simplePos="0" relativeHeight="251669504" behindDoc="0" locked="0" layoutInCell="1" allowOverlap="1" ns5:anchorId="6FC6D5A9" ns5:editId="14A0CBC4">
+            <ns4:simplePos x="0" y="0"/>
+            <ns4:positionH relativeFrom="column">
+              <ns4:posOffset>320040</ns4:posOffset>
+            </ns4:positionH>
+            <ns4:positionV relativeFrom="paragraph">
+              <ns4:posOffset>284480</ns4:posOffset>
+            </ns4:positionV>
+            <ns4:extent cx="5092700" cy="3048000"/>
+            <ns4:effectExtent l="0" t="0" r="0" b="0"/>
+            <ns4:wrapTopAndBottom/>
+            <ns4:docPr id="1349100464" name="Рисунок 1"/>
+            <ns4:cNvGraphicFramePr>
+              <ns6:graphicFrameLocks noChangeAspect="1"/>
+            </ns4:cNvGraphicFramePr>
+            <ns6:graphic>
+              <ns6:graphicData uri="http://schemas.openxmlformats.org/drawingml/2006/picture">
+                <ns7:pic>
+                  <ns7:nvPicPr>
+                    <ns7:cNvPr id="1349100464" name=""/>
+                    <ns7:cNvPicPr/>
+                  </ns7:nvPicPr>
+                  <ns7:blipFill>
+                    <ns6:blip ns3:embed="rId12"/>
+                    <ns6:stretch>
+                      <ns6:fillRect/>
+                    </ns6:stretch>
+                  </ns7:blipFill>
+                  <ns7:spPr>
+                    <ns6:xfrm>
+                      <ns6:off x="0" y="0"/>
+                      <ns6:ext cx="5092700" cy="3048000"/>
+                    </ns6:xfrm>
+                    <ns6:prstGeom prst="rect">
+                      <ns6:avLst/>
+                    </ns6:prstGeom>
+                  </ns7:spPr>
+                </ns7:pic>
+              </ns6:graphicData>
+            </ns6:graphic>
+            <ns5:sizeRelH relativeFrom="margin">
+              <ns5:pctWidth>0</ns5:pctWidth>
+            </ns5:sizeRelH>
+            <ns5:sizeRelV relativeFrom="margin">
+              <ns5:pctHeight>0</ns5:pctHeight>
+            </ns5:sizeRelV>
+          </ns4:anchor>
         </w:drawing>
       </w:r>
       <w:r>
@@ -3662,7 +3662,7 @@
         <w:t xml:space="preserve"> и написал первый коммит</w:t>
       </w:r>
     </w:p>
-    <w:p>
+    <w:p ns2:paraId="5BAC2FA8" ns2:textId="5C6AE150">
       <w:pPr>
         <w:spacing w:after="0" w:line="360" w:lineRule="auto"/>
         <w:ind w:firstLine="709"/>
@@ -3682,7 +3682,7 @@
         <w:br w:type="page"/>
       </w:r>
     </w:p>
-    <w:p>
+    <w:p ns2:paraId="6B1AC99D" ns2:textId="4C9F703E">
       <w:pPr>
         <w:spacing w:after="0" w:line="360" w:lineRule="auto"/>
         <w:ind w:firstLine="709"/>
@@ -3694,7 +3694,7 @@
         </w:rPr>
       </w:pPr>
     </w:p>
-    <w:p>
+    <w:p ns2:paraId="576C5CBA" ns2:textId="599A7067">
       <w:pPr>
         <w:spacing w:after="0" w:line="360" w:lineRule="auto"/>
         <w:ind w:firstLine="709"/>
@@ -3712,47 +3712,47 @@
           <w:szCs w:val="28"/>
         </w:rPr>
         <w:drawing>
-          <wp:anchor distT="0" distB="0" distL="114300" distR="114300" simplePos="0" relativeHeight="251671552" behindDoc="0" locked="0" layoutInCell="1" allowOverlap="1" wp14:anchorId="6C640B43" wp14:editId="4258E0E9">
-            <wp:simplePos x="0" y="0"/>
-            <wp:positionH relativeFrom="column">
-              <wp:posOffset>38100</wp:posOffset>
-            </wp:positionH>
-            <wp:positionV relativeFrom="paragraph">
-              <wp:posOffset>258445</wp:posOffset>
-            </wp:positionV>
-            <wp:extent cx="5940425" cy="1950085"/>
-            <wp:effectExtent l="0" t="0" r="3175" b="0"/>
-            <wp:wrapTopAndBottom/>
-            <wp:docPr id="1032563615" name="Рисунок 1"/>
-            <wp:cNvGraphicFramePr>
-              <a:graphicFrameLocks xmlns:a="http://schemas.openxmlformats.org/drawingml/2006/main" noChangeAspect="1"/>
-            </wp:cNvGraphicFramePr>
-            <a:graphic xmlns:a="http://schemas.openxmlformats.org/drawingml/2006/main">
-              <a:graphicData uri="http://schemas.openxmlformats.org/drawingml/2006/picture">
-                <pic:pic xmlns:pic="http://schemas.openxmlformats.org/drawingml/2006/picture">
-                  <pic:nvPicPr>
-                    <pic:cNvPr id="1032563615" name=""/>
-                    <pic:cNvPicPr/>
-                  </pic:nvPicPr>
-                  <pic:blipFill>
-                    <a:blip r:embed="rId13"/>
-                    <a:stretch>
-                      <a:fillRect/>
-                    </a:stretch>
-                  </pic:blipFill>
-                  <pic:spPr>
-                    <a:xfrm>
-                      <a:off x="0" y="0"/>
-                      <a:ext cx="5940425" cy="1950085"/>
-                    </a:xfrm>
-                    <a:prstGeom prst="rect">
-                      <a:avLst/>
-                    </a:prstGeom>
-                  </pic:spPr>
-                </pic:pic>
-              </a:graphicData>
-            </a:graphic>
-          </wp:anchor>
+          <ns4:anchor distT="0" distB="0" distL="114300" distR="114300" simplePos="0" relativeHeight="251671552" behindDoc="0" locked="0" layoutInCell="1" allowOverlap="1" ns5:anchorId="6C640B43" ns5:editId="4258E0E9">
+            <ns4:simplePos x="0" y="0"/>
+            <ns4:positionH relativeFrom="column">
+              <ns4:posOffset>38100</ns4:posOffset>
+            </ns4:positionH>
+            <ns4:positionV relativeFrom="paragraph">
+              <ns4:posOffset>258445</ns4:posOffset>
+            </ns4:positionV>
+            <ns4:extent cx="5940425" cy="1950085"/>
+            <ns4:effectExtent l="0" t="0" r="3175" b="0"/>
+            <ns4:wrapTopAndBottom/>
+            <ns4:docPr id="1032563615" name="Рисунок 1"/>
+            <ns4:cNvGraphicFramePr>
+              <ns6:graphicFrameLocks noChangeAspect="1"/>
+            </ns4:cNvGraphicFramePr>
+            <ns6:graphic>
+              <ns6:graphicData uri="http://schemas.openxmlformats.org/drawingml/2006/picture">
+                <ns7:pic>
+                  <ns7:nvPicPr>
+                    <ns7:cNvPr id="1032563615" name=""/>
+                    <ns7:cNvPicPr/>
+                  </ns7:nvPicPr>
+                  <ns7:blipFill>
+                    <ns6:blip ns3:embed="rId13"/>
+                    <ns6:stretch>
+                      <ns6:fillRect/>
+                    </ns6:stretch>
+                  </ns7:blipFill>
+                  <ns7:spPr>
+                    <ns6:xfrm>
+                      <ns6:off x="0" y="0"/>
+                      <ns6:ext cx="5940425" cy="1950085"/>
+                    </ns6:xfrm>
+                    <ns6:prstGeom prst="rect">
+                      <ns6:avLst/>
+                    </ns6:prstGeom>
+                  </ns7:spPr>
+                </ns7:pic>
+              </ns6:graphicData>
+            </ns6:graphic>
+          </ns4:anchor>
         </w:drawing>
       </w:r>
       <w:r>
@@ -3764,7 +3764,7 @@
         <w:t>Отправил все файлы в гит на основной ветке</w:t>
       </w:r>
     </w:p>
-    <w:p>
+    <w:p ns2:paraId="3C0A5624" ns2:textId="1D505928">
       <w:pPr>
         <w:spacing w:after="0" w:line="360" w:lineRule="auto"/>
         <w:ind w:firstLine="709"/>
@@ -3776,7 +3776,7 @@
         </w:rPr>
       </w:pPr>
     </w:p>
-    <w:p>
+    <w:p ns2:paraId="1D272D12" ns2:textId="44465B3F">
       <w:pPr>
         <w:spacing w:after="0" w:line="360" w:lineRule="auto"/>
         <w:ind w:firstLine="709"/>
@@ -3795,47 +3795,47 @@
           <w:szCs w:val="28"/>
         </w:rPr>
         <w:drawing>
-          <wp:anchor distT="0" distB="0" distL="114300" distR="114300" simplePos="0" relativeHeight="251675648" behindDoc="0" locked="0" layoutInCell="1" allowOverlap="1" wp14:anchorId="0D522F45" wp14:editId="6BF0708F">
-            <wp:simplePos x="0" y="0"/>
-            <wp:positionH relativeFrom="column">
-              <wp:posOffset>99060</wp:posOffset>
-            </wp:positionH>
-            <wp:positionV relativeFrom="paragraph">
-              <wp:posOffset>581660</wp:posOffset>
-            </wp:positionV>
-            <wp:extent cx="5940425" cy="1256665"/>
-            <wp:effectExtent l="0" t="0" r="3175" b="635"/>
-            <wp:wrapTopAndBottom/>
-            <wp:docPr id="1929326121" name="Рисунок 1"/>
-            <wp:cNvGraphicFramePr>
-              <a:graphicFrameLocks xmlns:a="http://schemas.openxmlformats.org/drawingml/2006/main" noChangeAspect="1"/>
-            </wp:cNvGraphicFramePr>
-            <a:graphic xmlns:a="http://schemas.openxmlformats.org/drawingml/2006/main">
-              <a:graphicData uri="http://schemas.openxmlformats.org/drawingml/2006/picture">
-                <pic:pic xmlns:pic="http://schemas.openxmlformats.org/drawingml/2006/picture">
-                  <pic:nvPicPr>
-                    <pic:cNvPr id="1929326121" name=""/>
-                    <pic:cNvPicPr/>
-                  </pic:nvPicPr>
-                  <pic:blipFill>
-                    <a:blip r:embed="rId14"/>
-                    <a:stretch>
-                      <a:fillRect/>
-                    </a:stretch>
-                  </pic:blipFill>
-                  <pic:spPr>
-                    <a:xfrm>
-                      <a:off x="0" y="0"/>
-                      <a:ext cx="5940425" cy="1256665"/>
-                    </a:xfrm>
-                    <a:prstGeom prst="rect">
-                      <a:avLst/>
-                    </a:prstGeom>
-                  </pic:spPr>
-                </pic:pic>
-              </a:graphicData>
-            </a:graphic>
-          </wp:anchor>
+          <ns4:anchor distT="0" distB="0" distL="114300" distR="114300" simplePos="0" relativeHeight="251675648" behindDoc="0" locked="0" layoutInCell="1" allowOverlap="1" ns5:anchorId="0D522F45" ns5:editId="6BF0708F">
+            <ns4:simplePos x="0" y="0"/>
+            <ns4:positionH relativeFrom="column">
+              <ns4:posOffset>99060</ns4:posOffset>
+            </ns4:positionH>
+            <ns4:positionV relativeFrom="paragraph">
+              <ns4:posOffset>581660</ns4:posOffset>
+            </ns4:positionV>
+            <ns4:extent cx="5940425" cy="1256665"/>
+            <ns4:effectExtent l="0" t="0" r="3175" b="635"/>
+            <ns4:wrapTopAndBottom/>
+            <ns4:docPr id="1929326121" name="Рисунок 1"/>
+            <ns4:cNvGraphicFramePr>
+              <ns6:graphicFrameLocks noChangeAspect="1"/>
+            </ns4:cNvGraphicFramePr>
+            <ns6:graphic>
+              <ns6:graphicData uri="http://schemas.openxmlformats.org/drawingml/2006/picture">
+                <ns7:pic>
+                  <ns7:nvPicPr>
+                    <ns7:cNvPr id="1929326121" name=""/>
+                    <ns7:cNvPicPr/>
+                  </ns7:nvPicPr>
+                  <ns7:blipFill>
+                    <ns6:blip ns3:embed="rId14"/>
+                    <ns6:stretch>
+                      <ns6:fillRect/>
+                    </ns6:stretch>
+                  </ns7:blipFill>
+                  <ns7:spPr>
+                    <ns6:xfrm>
+                      <ns6:off x="0" y="0"/>
+                      <ns6:ext cx="5940425" cy="1256665"/>
+                    </ns6:xfrm>
+                    <ns6:prstGeom prst="rect">
+                      <ns6:avLst/>
+                    </ns6:prstGeom>
+                  </ns7:spPr>
+                </ns7:pic>
+              </ns6:graphicData>
+            </ns6:graphic>
+          </ns4:anchor>
         </w:drawing>
       </w:r>
       <w:r>
@@ -3863,7 +3863,7 @@
         <w:t xml:space="preserve"> и написал к ним коммиты</w:t>
       </w:r>
     </w:p>
-    <w:p>
+    <w:p ns2:paraId="650DCC98" ns2:textId="5F05A58B">
       <w:pPr>
         <w:spacing w:after="0" w:line="360" w:lineRule="auto"/>
         <w:ind w:firstLine="709"/>
@@ -3875,7 +3875,7 @@
         </w:rPr>
       </w:pPr>
     </w:p>
-    <w:p>
+    <w:p ns2:paraId="3CD7D38F" ns2:textId="4BE4B247">
       <w:pPr>
         <w:spacing w:after="0" w:line="360" w:lineRule="auto"/>
         <w:ind w:firstLine="709"/>
@@ -3896,7 +3896,7 @@
         <w:t xml:space="preserve"> </w:t>
       </w:r>
     </w:p>
-    <w:p>
+    <w:p ns2:paraId="73799C31" ns2:textId="7ADB5E80">
       <w:pPr>
         <w:spacing w:after="0" w:line="360" w:lineRule="auto"/>
         <w:ind w:firstLine="709"/>
@@ -3914,47 +3914,47 @@
           <w:szCs w:val="28"/>
         </w:rPr>
         <w:drawing>
-          <wp:anchor distT="0" distB="0" distL="114300" distR="114300" simplePos="0" relativeHeight="251673600" behindDoc="0" locked="0" layoutInCell="1" allowOverlap="1" wp14:anchorId="2581EC90" wp14:editId="10DC870F">
-            <wp:simplePos x="0" y="0"/>
-            <wp:positionH relativeFrom="column">
-              <wp:posOffset>152400</wp:posOffset>
-            </wp:positionH>
-            <wp:positionV relativeFrom="paragraph">
-              <wp:posOffset>273050</wp:posOffset>
-            </wp:positionV>
-            <wp:extent cx="5940425" cy="2061210"/>
-            <wp:effectExtent l="0" t="0" r="3175" b="0"/>
-            <wp:wrapTopAndBottom/>
-            <wp:docPr id="1387252429" name="Рисунок 1"/>
-            <wp:cNvGraphicFramePr>
-              <a:graphicFrameLocks xmlns:a="http://schemas.openxmlformats.org/drawingml/2006/main" noChangeAspect="1"/>
-            </wp:cNvGraphicFramePr>
-            <a:graphic xmlns:a="http://schemas.openxmlformats.org/drawingml/2006/main">
-              <a:graphicData uri="http://schemas.openxmlformats.org/drawingml/2006/picture">
-                <pic:pic xmlns:pic="http://schemas.openxmlformats.org/drawingml/2006/picture">
-                  <pic:nvPicPr>
-                    <pic:cNvPr id="1387252429" name=""/>
-                    <pic:cNvPicPr/>
-                  </pic:nvPicPr>
-                  <pic:blipFill>
-                    <a:blip r:embed="rId15"/>
-                    <a:stretch>
-                      <a:fillRect/>
-                    </a:stretch>
-                  </pic:blipFill>
-                  <pic:spPr>
-                    <a:xfrm>
-                      <a:off x="0" y="0"/>
-                      <a:ext cx="5940425" cy="2061210"/>
-                    </a:xfrm>
-                    <a:prstGeom prst="rect">
-                      <a:avLst/>
-                    </a:prstGeom>
-                  </pic:spPr>
-                </pic:pic>
-              </a:graphicData>
-            </a:graphic>
-          </wp:anchor>
+          <ns4:anchor distT="0" distB="0" distL="114300" distR="114300" simplePos="0" relativeHeight="251673600" behindDoc="0" locked="0" layoutInCell="1" allowOverlap="1" ns5:anchorId="2581EC90" ns5:editId="10DC870F">
+            <ns4:simplePos x="0" y="0"/>
+            <ns4:positionH relativeFrom="column">
+              <ns4:posOffset>152400</ns4:posOffset>
+            </ns4:positionH>
+            <ns4:positionV relativeFrom="paragraph">
+              <ns4:posOffset>273050</ns4:posOffset>
+            </ns4:positionV>
+            <ns4:extent cx="5940425" cy="2061210"/>
+            <ns4:effectExtent l="0" t="0" r="3175" b="0"/>
+            <ns4:wrapTopAndBottom/>
+            <ns4:docPr id="1387252429" name="Рисунок 1"/>
+            <ns4:cNvGraphicFramePr>
+              <ns6:graphicFrameLocks noChangeAspect="1"/>
+            </ns4:cNvGraphicFramePr>
+            <ns6:graphic>
+              <ns6:graphicData uri="http://schemas.openxmlformats.org/drawingml/2006/picture">
+                <ns7:pic>
+                  <ns7:nvPicPr>
+                    <ns7:cNvPr id="1387252429" name=""/>
+                    <ns7:cNvPicPr/>
+                  </ns7:nvPicPr>
+                  <ns7:blipFill>
+                    <ns6:blip ns3:embed="rId15"/>
+                    <ns6:stretch>
+                      <ns6:fillRect/>
+                    </ns6:stretch>
+                  </ns7:blipFill>
+                  <ns7:spPr>
+                    <ns6:xfrm>
+                      <ns6:off x="0" y="0"/>
+                      <ns6:ext cx="5940425" cy="2061210"/>
+                    </ns6:xfrm>
+                    <ns6:prstGeom prst="rect">
+                      <ns6:avLst/>
+                    </ns6:prstGeom>
+                  </ns7:spPr>
+                </ns7:pic>
+              </ns6:graphicData>
+            </ns6:graphic>
+          </ns4:anchor>
         </w:drawing>
       </w:r>
       <w:r>
@@ -4022,7 +4022,7 @@
         <w:t>у</w:t>
       </w:r>
     </w:p>
-    <w:p>
+    <w:p ns2:paraId="5B69129C" ns2:textId="4CC556CD">
       <w:pPr>
         <w:spacing w:after="0" w:line="360" w:lineRule="auto"/>
         <w:ind w:firstLine="709"/>
@@ -4042,7 +4042,7 @@
         <w:br w:type="page"/>
       </w:r>
     </w:p>
-    <w:p>
+    <w:p ns2:paraId="343E0AA2" ns2:textId="4C2081A5">
       <w:pPr>
         <w:spacing w:after="0" w:line="360" w:lineRule="auto"/>
         <w:ind w:firstLine="709"/>
@@ -4113,7 +4113,7 @@
         <w:t>git</w:t>
       </w:r>
     </w:p>
-    <w:p>
+    <w:p ns2:paraId="2F240776" ns2:textId="23CCF34F">
       <w:pPr>
         <w:spacing w:after="0" w:line="360" w:lineRule="auto"/>
         <w:ind w:firstLine="709"/>
@@ -4131,51 +4131,51 @@
           <w:szCs w:val="28"/>
         </w:rPr>
         <w:drawing>
-          <wp:anchor distT="0" distB="0" distL="114300" distR="114300" simplePos="0" relativeHeight="251677696" behindDoc="0" locked="0" layoutInCell="1" allowOverlap="1" wp14:anchorId="089ED84C" wp14:editId="37D844BD">
-            <wp:simplePos x="0" y="0"/>
-            <wp:positionH relativeFrom="column">
-              <wp:posOffset>38100</wp:posOffset>
-            </wp:positionH>
-            <wp:positionV relativeFrom="paragraph">
-              <wp:posOffset>106045</wp:posOffset>
-            </wp:positionV>
-            <wp:extent cx="5940425" cy="4979035"/>
-            <wp:effectExtent l="0" t="0" r="3175" b="0"/>
-            <wp:wrapTopAndBottom/>
-            <wp:docPr id="93168163" name="Рисунок 1"/>
-            <wp:cNvGraphicFramePr>
-              <a:graphicFrameLocks xmlns:a="http://schemas.openxmlformats.org/drawingml/2006/main" noChangeAspect="1"/>
-            </wp:cNvGraphicFramePr>
-            <a:graphic xmlns:a="http://schemas.openxmlformats.org/drawingml/2006/main">
-              <a:graphicData uri="http://schemas.openxmlformats.org/drawingml/2006/picture">
-                <pic:pic xmlns:pic="http://schemas.openxmlformats.org/drawingml/2006/picture">
-                  <pic:nvPicPr>
-                    <pic:cNvPr id="93168163" name=""/>
-                    <pic:cNvPicPr/>
-                  </pic:nvPicPr>
-                  <pic:blipFill>
-                    <a:blip r:embed="rId16"/>
-                    <a:stretch>
-                      <a:fillRect/>
-                    </a:stretch>
-                  </pic:blipFill>
-                  <pic:spPr>
-                    <a:xfrm>
-                      <a:off x="0" y="0"/>
-                      <a:ext cx="5940425" cy="4979035"/>
-                    </a:xfrm>
-                    <a:prstGeom prst="rect">
-                      <a:avLst/>
-                    </a:prstGeom>
-                  </pic:spPr>
-                </pic:pic>
-              </a:graphicData>
-            </a:graphic>
-          </wp:anchor>
+          <ns4:anchor distT="0" distB="0" distL="114300" distR="114300" simplePos="0" relativeHeight="251677696" behindDoc="0" locked="0" layoutInCell="1" allowOverlap="1" ns5:anchorId="089ED84C" ns5:editId="37D844BD">
+            <ns4:simplePos x="0" y="0"/>
+            <ns4:positionH relativeFrom="column">
+              <ns4:posOffset>38100</ns4:posOffset>
+            </ns4:positionH>
+            <ns4:positionV relativeFrom="paragraph">
+              <ns4:posOffset>106045</ns4:posOffset>
+            </ns4:positionV>
+            <ns4:extent cx="5940425" cy="4979035"/>
+            <ns4:effectExtent l="0" t="0" r="3175" b="0"/>
+            <ns4:wrapTopAndBottom/>
+            <ns4:docPr id="93168163" name="Рисунок 1"/>
+            <ns4:cNvGraphicFramePr>
+              <ns6:graphicFrameLocks noChangeAspect="1"/>
+            </ns4:cNvGraphicFramePr>
+            <ns6:graphic>
+              <ns6:graphicData uri="http://schemas.openxmlformats.org/drawingml/2006/picture">
+                <ns7:pic>
+                  <ns7:nvPicPr>
+                    <ns7:cNvPr id="93168163" name=""/>
+                    <ns7:cNvPicPr/>
+                  </ns7:nvPicPr>
+                  <ns7:blipFill>
+                    <ns6:blip ns3:embed="rId16"/>
+                    <ns6:stretch>
+                      <ns6:fillRect/>
+                    </ns6:stretch>
+                  </ns7:blipFill>
+                  <ns7:spPr>
+                    <ns6:xfrm>
+                      <ns6:off x="0" y="0"/>
+                      <ns6:ext cx="5940425" cy="4979035"/>
+                    </ns6:xfrm>
+                    <ns6:prstGeom prst="rect">
+                      <ns6:avLst/>
+                    </ns6:prstGeom>
+                  </ns7:spPr>
+                </ns7:pic>
+              </ns6:graphicData>
+            </ns6:graphic>
+          </ns4:anchor>
         </w:drawing>
       </w:r>
     </w:p>
-    <w:p>
+    <w:p ns2:paraId="3D976EA8" ns2:textId="2BE204CC">
       <w:pPr>
         <w:spacing w:after="0" w:line="360" w:lineRule="auto"/>
         <w:ind w:firstLine="709"/>
@@ -4195,7 +4195,7 @@
         <w:br w:type="page"/>
       </w:r>
     </w:p>
-    <w:p>
+    <w:p ns2:paraId="18DED11E" ns2:textId="062C7057">
       <w:pPr>
         <w:pStyle w:val="1"/>
         <w:jc w:val="center"/>
@@ -4250,7 +4250,7 @@
       </w:r>
       <w:bookmarkEnd w:id="7"/>
     </w:p>
-    <w:p>
+    <w:p ns2:paraId="37E98F84" ns2:textId="77777777">
       <w:pPr>
         <w:spacing w:after="0" w:line="360" w:lineRule="auto"/>
         <w:ind w:firstLine="709"/>
@@ -4271,7 +4271,7 @@
         <w:t>Структура проекта</w:t>
       </w:r>
     </w:p>
-    <w:p>
+    <w:p ns2:paraId="16338236" ns2:textId="77777777">
       <w:pPr>
         <w:spacing w:after="0" w:line="360" w:lineRule="auto"/>
         <w:jc w:val="both"/>
@@ -4290,7 +4290,7 @@
         <w:t>Проект содержит следующие основные файлы:</w:t>
       </w:r>
     </w:p>
-    <w:p>
+    <w:p ns2:paraId="5117217D" ns2:textId="77777777">
       <w:pPr>
         <w:spacing w:after="0" w:line="360" w:lineRule="auto"/>
         <w:jc w:val="both"/>
@@ -4312,7 +4312,7 @@
         <w:t>graph.cpp</w:t>
       </w:r>
     </w:p>
-    <w:p>
+    <w:p ns2:paraId="7F6CAA5F" ns2:textId="77777777">
       <w:pPr>
         <w:spacing w:after="0" w:line="360" w:lineRule="auto"/>
         <w:jc w:val="both"/>
@@ -4344,7 +4344,7 @@
         <w:t>:</w:t>
       </w:r>
     </w:p>
-    <w:p>
+    <w:p ns2:paraId="06D10948" ns2:textId="77777777">
       <w:pPr>
         <w:spacing w:after="0" w:line="360" w:lineRule="auto"/>
         <w:jc w:val="both"/>
@@ -4416,7 +4416,7 @@
         <w:t>;</w:t>
       </w:r>
     </w:p>
-    <w:p>
+    <w:p ns2:paraId="1C5DD1EB" ns2:textId="77777777">
       <w:pPr>
         <w:spacing w:after="0" w:line="360" w:lineRule="auto"/>
         <w:jc w:val="both"/>
@@ -4468,7 +4468,7 @@
         <w:t xml:space="preserve"> Windows;</w:t>
       </w:r>
     </w:p>
-    <w:p>
+    <w:p ns2:paraId="564AF824" ns2:textId="77777777">
       <w:pPr>
         <w:spacing w:after="0" w:line="360" w:lineRule="auto"/>
         <w:jc w:val="both"/>
@@ -4540,7 +4540,7 @@
         <w:t>;</w:t>
       </w:r>
     </w:p>
-    <w:p>
+    <w:p ns2:paraId="151E59C4" ns2:textId="77777777">
       <w:pPr>
         <w:spacing w:after="0" w:line="360" w:lineRule="auto"/>
         <w:jc w:val="both"/>
@@ -4632,7 +4632,7 @@
         <w:t>.</w:t>
       </w:r>
     </w:p>
-    <w:p>
+    <w:p ns2:paraId="48668221" ns2:textId="77777777">
       <w:pPr>
         <w:spacing w:after="0" w:line="360" w:lineRule="auto"/>
         <w:jc w:val="both"/>
@@ -4657,7 +4657,7 @@
       </w:r>
       <w:proofErr w:type="spellEnd"/>
     </w:p>
-    <w:p>
+    <w:p ns2:paraId="1F9B023C" ns2:textId="77777777">
       <w:pPr>
         <w:spacing w:after="0" w:line="360" w:lineRule="auto"/>
         <w:jc w:val="both"/>
@@ -4689,7 +4689,7 @@
         <w:t>:</w:t>
       </w:r>
     </w:p>
-    <w:p>
+    <w:p ns2:paraId="18B16DE6" ns2:textId="77777777">
       <w:pPr>
         <w:spacing w:after="0" w:line="360" w:lineRule="auto"/>
         <w:jc w:val="both"/>
@@ -4742,7 +4742,7 @@
         <w:t>;</w:t>
       </w:r>
     </w:p>
-    <w:p>
+    <w:p ns2:paraId="69D1C993" ns2:textId="77777777">
       <w:pPr>
         <w:spacing w:after="0" w:line="360" w:lineRule="auto"/>
         <w:jc w:val="both"/>
@@ -4794,7 +4794,7 @@
         <w:t xml:space="preserve"> Graph;</w:t>
       </w:r>
     </w:p>
-    <w:p>
+    <w:p ns2:paraId="302EEF02" ns2:textId="77777777">
       <w:pPr>
         <w:spacing w:after="0" w:line="360" w:lineRule="auto"/>
         <w:jc w:val="both"/>
@@ -4813,7 +4813,7 @@
         <w:t>алгоритмы построения матрицы расстояний и дерева Прима.</w:t>
       </w:r>
     </w:p>
-    <w:p>
+    <w:p ns2:paraId="1393FB11" ns2:textId="77777777">
       <w:pPr>
         <w:spacing w:after="0" w:line="360" w:lineRule="auto"/>
         <w:jc w:val="both"/>
@@ -4888,7 +4888,7 @@
       </w:r>
       <w:proofErr w:type="spellEnd"/>
     </w:p>
-    <w:p>
+    <w:p ns2:paraId="2F137EC3" ns2:textId="77777777">
       <w:pPr>
         <w:spacing w:after="0" w:line="360" w:lineRule="auto"/>
         <w:jc w:val="both"/>
@@ -4907,7 +4907,7 @@
         <w:t>Содержат описание ресурсов приложения и элементов интерфейса.</w:t>
       </w:r>
     </w:p>
-    <w:p>
+    <w:p ns2:paraId="19F2D28A" ns2:textId="42B6E3FB">
       <w:pPr>
         <w:spacing w:after="0" w:line="360" w:lineRule="auto"/>
         <w:ind w:firstLine="709"/>
@@ -4920,7 +4920,7 @@
         </w:rPr>
       </w:pPr>
     </w:p>
-    <w:p>
+    <w:p ns2:paraId="1383A77E" ns2:textId="77777777">
       <w:pPr>
         <w:spacing w:after="0" w:line="360" w:lineRule="auto"/>
         <w:ind w:firstLine="709"/>
@@ -4943,7 +4943,7 @@
         <w:t>Описание основных структур данных</w:t>
       </w:r>
     </w:p>
-    <w:p>
+    <w:p ns2:paraId="3CBD3875" ns2:textId="77777777">
       <w:pPr>
         <w:spacing w:after="0" w:line="360" w:lineRule="auto"/>
         <w:jc w:val="both"/>
@@ -4972,7 +4972,7 @@
         <w:t>Vertex</w:t>
       </w:r>
     </w:p>
-    <w:p>
+    <w:p ns2:paraId="422BB65F" ns2:textId="77777777">
       <w:pPr>
         <w:spacing w:after="0" w:line="360" w:lineRule="auto"/>
         <w:jc w:val="both"/>
@@ -4991,7 +4991,7 @@
         <w:t>Структура предназначена для хранения информации о вершине графа.</w:t>
       </w:r>
     </w:p>
-    <w:p>
+    <w:p ns2:paraId="22003A7F" ns2:textId="77777777">
       <w:pPr>
         <w:spacing w:after="0" w:line="360" w:lineRule="auto"/>
         <w:jc w:val="both"/>
@@ -5043,7 +5043,7 @@
         <w:t>:</w:t>
       </w:r>
     </w:p>
-    <w:p>
+    <w:p ns2:paraId="7DD0E7C2" ns2:textId="77777777">
       <w:pPr>
         <w:spacing w:after="0" w:line="360" w:lineRule="auto"/>
         <w:jc w:val="both"/>
@@ -5088,7 +5088,7 @@
         <w:t>;</w:t>
       </w:r>
     </w:p>
-    <w:p>
+    <w:p ns2:paraId="52580492" ns2:textId="77777777">
       <w:pPr>
         <w:spacing w:after="0" w:line="360" w:lineRule="auto"/>
         <w:jc w:val="both"/>
@@ -5133,7 +5133,7 @@
         <w:t>;</w:t>
       </w:r>
     </w:p>
-    <w:p>
+    <w:p ns2:paraId="15B44210" ns2:textId="77777777">
       <w:pPr>
         <w:spacing w:after="0" w:line="360" w:lineRule="auto"/>
         <w:jc w:val="both"/>
@@ -5214,7 +5214,7 @@
         <w:t>.</w:t>
       </w:r>
     </w:p>
-    <w:p>
+    <w:p ns2:paraId="3F571E4E" ns2:textId="001F933E">
       <w:pPr>
         <w:spacing w:after="0" w:line="360" w:lineRule="auto"/>
         <w:ind w:firstLine="709"/>
@@ -5227,7 +5227,7 @@
         </w:rPr>
       </w:pPr>
     </w:p>
-    <w:p>
+    <w:p ns2:paraId="0C325C8C" ns2:textId="77777777">
       <w:pPr>
         <w:spacing w:after="0" w:line="360" w:lineRule="auto"/>
         <w:ind w:firstLine="709"/>
@@ -5258,7 +5258,7 @@
         <w:t>Edge</w:t>
       </w:r>
     </w:p>
-    <w:p>
+    <w:p ns2:paraId="031521E8" ns2:textId="77777777">
       <w:pPr>
         <w:spacing w:after="0" w:line="360" w:lineRule="auto"/>
         <w:jc w:val="both"/>
@@ -5277,7 +5277,7 @@
         <w:t>Структура описывает ребро графа.</w:t>
       </w:r>
     </w:p>
-    <w:p>
+    <w:p ns2:paraId="5CC279DA" ns2:textId="77777777">
       <w:pPr>
         <w:spacing w:after="0" w:line="360" w:lineRule="auto"/>
         <w:jc w:val="both"/>
@@ -5296,7 +5296,7 @@
         <w:t>Поля:</w:t>
       </w:r>
     </w:p>
-    <w:p>
+    <w:p ns2:paraId="2BC97F5C" ns2:textId="77777777">
       <w:pPr>
         <w:spacing w:after="0" w:line="360" w:lineRule="auto"/>
         <w:jc w:val="both"/>
@@ -5324,7 +5324,7 @@
         <w:t>_ — первая вершина;</w:t>
       </w:r>
     </w:p>
-    <w:p>
+    <w:p ns2:paraId="6C27AAC3" ns2:textId="77777777">
       <w:pPr>
         <w:spacing w:after="0" w:line="360" w:lineRule="auto"/>
         <w:jc w:val="both"/>
@@ -5352,7 +5352,7 @@
         <w:t>_ — вторая вершина;</w:t>
       </w:r>
     </w:p>
-    <w:p>
+    <w:p ns2:paraId="48CED979" ns2:textId="77777777">
       <w:pPr>
         <w:spacing w:after="0" w:line="360" w:lineRule="auto"/>
         <w:jc w:val="both"/>
@@ -5381,18 +5381,18 @@
         <w:t>_ — длина ребра.</w:t>
       </w:r>
     </w:p>
-    <w:p>
-      <w:pPr>
-        <w:spacing w:after="0" w:line="360" w:lineRule="auto"/>
-        <w:jc w:val="both"/>
-        <w:rPr>
-          <w:rFonts w:ascii="Times New Roman" w:eastAsia="Aptos" w:hAnsi="Times New Roman"/>
-          <w:sz w:val="28"/>
-          <w:szCs w:val="28"/>
-        </w:rPr>
-      </w:pPr>
-    </w:p>
-    <w:p>
+    <w:p ns2:paraId="4279E0AE" ns2:textId="7D54F536">
+      <w:pPr>
+        <w:spacing w:after="0" w:line="360" w:lineRule="auto"/>
+        <w:jc w:val="both"/>
+        <w:rPr>
+          <w:rFonts w:ascii="Times New Roman" w:eastAsia="Aptos" w:hAnsi="Times New Roman"/>
+          <w:sz w:val="28"/>
+          <w:szCs w:val="28"/>
+        </w:rPr>
+      </w:pPr>
+    </w:p>
+    <w:p ns2:paraId="58AD585D" ns2:textId="77777777">
       <w:pPr>
         <w:spacing w:after="0" w:line="360" w:lineRule="auto"/>
         <w:ind w:firstLine="708"/>
@@ -5423,7 +5423,7 @@
         <w:t>Graph</w:t>
       </w:r>
     </w:p>
-    <w:p>
+    <w:p ns2:paraId="0D23C9DF" ns2:textId="77777777">
       <w:pPr>
         <w:spacing w:after="0" w:line="360" w:lineRule="auto"/>
         <w:jc w:val="both"/>
@@ -5459,7 +5459,7 @@
         <w:t xml:space="preserve"> реализует основную логику работы программы.</w:t>
       </w:r>
     </w:p>
-    <w:p>
+    <w:p ns2:paraId="31041A92" ns2:textId="77777777">
       <w:pPr>
         <w:spacing w:after="0" w:line="360" w:lineRule="auto"/>
         <w:jc w:val="both"/>
@@ -5531,7 +5531,7 @@
         <w:t>:</w:t>
       </w:r>
     </w:p>
-    <w:p>
+    <w:p ns2:paraId="057C337A" ns2:textId="77777777">
       <w:pPr>
         <w:spacing w:after="0" w:line="360" w:lineRule="auto"/>
         <w:jc w:val="both"/>
@@ -5603,7 +5603,7 @@
         <w:t>;</w:t>
       </w:r>
     </w:p>
-    <w:p>
+    <w:p ns2:paraId="08CF7A08" ns2:textId="77777777">
       <w:pPr>
         <w:spacing w:after="0" w:line="360" w:lineRule="auto"/>
         <w:jc w:val="both"/>
@@ -5675,7 +5675,7 @@
         <w:t>;</w:t>
       </w:r>
     </w:p>
-    <w:p>
+    <w:p ns2:paraId="1A894CEA" ns2:textId="77777777">
       <w:pPr>
         <w:spacing w:after="0" w:line="360" w:lineRule="auto"/>
         <w:jc w:val="both"/>
@@ -5703,7 +5703,7 @@
         <w:t>_ — массив рёбер минимального дерева;</w:t>
       </w:r>
     </w:p>
-    <w:p>
+    <w:p ns2:paraId="205875D7" ns2:textId="77777777">
       <w:pPr>
         <w:spacing w:after="0" w:line="360" w:lineRule="auto"/>
         <w:jc w:val="both"/>
@@ -5748,19 +5748,19 @@
         <w:t>_ — максимальное количество соседей вершины.</w:t>
       </w:r>
     </w:p>
-    <w:p>
-      <w:pPr>
-        <w:spacing w:after="0" w:line="360" w:lineRule="auto"/>
-        <w:jc w:val="both"/>
-        <w:rPr>
-          <w:rFonts w:ascii="Times New Roman" w:eastAsia="Aptos" w:hAnsi="Times New Roman"/>
-          <w:sz w:val="28"/>
-          <w:szCs w:val="28"/>
-          <w:lang w:val="en-US"/>
-        </w:rPr>
-      </w:pPr>
-    </w:p>
-    <w:p>
+    <w:p ns2:paraId="7CAD81DC" ns2:textId="7EB6B7D2">
+      <w:pPr>
+        <w:spacing w:after="0" w:line="360" w:lineRule="auto"/>
+        <w:jc w:val="both"/>
+        <w:rPr>
+          <w:rFonts w:ascii="Times New Roman" w:eastAsia="Aptos" w:hAnsi="Times New Roman"/>
+          <w:sz w:val="28"/>
+          <w:szCs w:val="28"/>
+          <w:lang w:val="en-US"/>
+        </w:rPr>
+      </w:pPr>
+    </w:p>
+    <w:p ns2:paraId="275BBD13" ns2:textId="77777777">
       <w:pPr>
         <w:spacing w:after="0" w:line="360" w:lineRule="auto"/>
         <w:ind w:firstLine="708"/>
@@ -5792,7 +5792,7 @@
         <w:t>Graph</w:t>
       </w:r>
     </w:p>
-    <w:p>
+    <w:p ns2:paraId="057147F7" ns2:textId="77777777">
       <w:pPr>
         <w:spacing w:after="0" w:line="360" w:lineRule="auto"/>
         <w:jc w:val="both"/>
@@ -5833,7 +5833,7 @@
         <w:t>)</w:t>
       </w:r>
     </w:p>
-    <w:p>
+    <w:p ns2:paraId="65E27BD6" ns2:textId="77777777">
       <w:pPr>
         <w:spacing w:after="0" w:line="360" w:lineRule="auto"/>
         <w:jc w:val="both"/>
@@ -5852,7 +5852,7 @@
         <w:t>Метод выполняет построение матрицы расстояний между всеми вершинами графа.</w:t>
       </w:r>
     </w:p>
-    <w:p>
+    <w:p ns2:paraId="3CB5A7EB" ns2:textId="77777777">
       <w:pPr>
         <w:spacing w:after="0" w:line="360" w:lineRule="auto"/>
         <w:jc w:val="both"/>
@@ -5871,19 +5871,19 @@
         <w:t>Для каждой пары вершин вычисляется евклидово расстояние и сохраняется в матрицу.</w:t>
       </w:r>
     </w:p>
-    <w:p>
-      <w:pPr>
-        <w:spacing w:after="0" w:line="360" w:lineRule="auto"/>
-        <w:jc w:val="both"/>
-        <w:rPr>
-          <w:rFonts w:ascii="Times New Roman" w:eastAsia="Aptos" w:hAnsi="Times New Roman"/>
-          <w:sz w:val="28"/>
-          <w:szCs w:val="28"/>
-          <w:lang w:val="en-US"/>
-        </w:rPr>
-      </w:pPr>
-    </w:p>
-    <w:p>
+    <w:p ns2:paraId="1FF7C0C8" ns2:textId="5EA1C2B0">
+      <w:pPr>
+        <w:spacing w:after="0" w:line="360" w:lineRule="auto"/>
+        <w:jc w:val="both"/>
+        <w:rPr>
+          <w:rFonts w:ascii="Times New Roman" w:eastAsia="Aptos" w:hAnsi="Times New Roman"/>
+          <w:sz w:val="28"/>
+          <w:szCs w:val="28"/>
+          <w:lang w:val="en-US"/>
+        </w:rPr>
+      </w:pPr>
+    </w:p>
+    <w:p ns2:paraId="7EAB8D66" ns2:textId="77777777">
       <w:pPr>
         <w:spacing w:after="0" w:line="360" w:lineRule="auto"/>
         <w:ind w:firstLine="708"/>
@@ -5929,7 +5929,7 @@
         <w:t>)</w:t>
       </w:r>
     </w:p>
-    <w:p>
+    <w:p ns2:paraId="165C6C9B" ns2:textId="77777777">
       <w:pPr>
         <w:spacing w:after="0" w:line="360" w:lineRule="auto"/>
         <w:jc w:val="both"/>
@@ -6001,7 +6001,7 @@
         <w:t xml:space="preserve"> Прима.</w:t>
       </w:r>
     </w:p>
-    <w:p>
+    <w:p ns2:paraId="72BF352C" ns2:textId="77777777">
       <w:pPr>
         <w:spacing w:after="0" w:line="360" w:lineRule="auto"/>
         <w:jc w:val="both"/>
@@ -6062,7 +6062,7 @@
         <w:t>:</w:t>
       </w:r>
     </w:p>
-    <w:p>
+    <w:p ns2:paraId="2C67C209" ns2:textId="77777777">
       <w:pPr>
         <w:spacing w:after="0" w:line="360" w:lineRule="auto"/>
         <w:jc w:val="both"/>
@@ -6134,7 +6134,7 @@
         <w:t>;</w:t>
       </w:r>
     </w:p>
-    <w:p>
+    <w:p ns2:paraId="238BA039" ns2:textId="77777777">
       <w:pPr>
         <w:spacing w:after="0" w:line="360" w:lineRule="auto"/>
         <w:jc w:val="both"/>
@@ -6226,7 +6226,7 @@
         <w:t>;</w:t>
       </w:r>
     </w:p>
-    <w:p>
+    <w:p ns2:paraId="3E8E7317" ns2:textId="77777777">
       <w:pPr>
         <w:spacing w:after="0" w:line="360" w:lineRule="auto"/>
         <w:jc w:val="both"/>
@@ -6245,7 +6245,7 @@
         <w:t>новая вершина добавляется в дерево;</w:t>
       </w:r>
     </w:p>
-    <w:p>
+    <w:p ns2:paraId="79E1FEA9" ns2:textId="77777777">
       <w:pPr>
         <w:spacing w:after="0" w:line="360" w:lineRule="auto"/>
         <w:jc w:val="both"/>
@@ -6337,19 +6337,19 @@
         <w:t>.</w:t>
       </w:r>
     </w:p>
-    <w:p>
-      <w:pPr>
-        <w:spacing w:after="0" w:line="360" w:lineRule="auto"/>
-        <w:jc w:val="both"/>
-        <w:rPr>
-          <w:rFonts w:ascii="Times New Roman" w:eastAsia="Aptos" w:hAnsi="Times New Roman"/>
-          <w:sz w:val="28"/>
-          <w:szCs w:val="28"/>
-          <w:lang w:val="en-US"/>
-        </w:rPr>
-      </w:pPr>
-    </w:p>
-    <w:p>
+    <w:p ns2:paraId="6DF39A45" ns2:textId="1FF394D7">
+      <w:pPr>
+        <w:spacing w:after="0" w:line="360" w:lineRule="auto"/>
+        <w:jc w:val="both"/>
+        <w:rPr>
+          <w:rFonts w:ascii="Times New Roman" w:eastAsia="Aptos" w:hAnsi="Times New Roman"/>
+          <w:sz w:val="28"/>
+          <w:szCs w:val="28"/>
+          <w:lang w:val="en-US"/>
+        </w:rPr>
+      </w:pPr>
+    </w:p>
+    <w:p ns2:paraId="35723317" ns2:textId="77777777">
       <w:pPr>
         <w:spacing w:after="0" w:line="360" w:lineRule="auto"/>
         <w:ind w:firstLine="708"/>
@@ -6392,7 +6392,7 @@
         <w:t>)</w:t>
       </w:r>
     </w:p>
-    <w:p>
+    <w:p ns2:paraId="791ED417" ns2:textId="77777777">
       <w:pPr>
         <w:spacing w:after="0" w:line="360" w:lineRule="auto"/>
         <w:jc w:val="both"/>
@@ -6411,18 +6411,18 @@
         <w:t>Метод возвращает список рёбер построенного дерева для дальнейшей визуализации.</w:t>
       </w:r>
     </w:p>
-    <w:p>
-      <w:pPr>
-        <w:spacing w:after="0" w:line="360" w:lineRule="auto"/>
-        <w:jc w:val="both"/>
-        <w:rPr>
-          <w:rFonts w:ascii="Times New Roman" w:eastAsia="Aptos" w:hAnsi="Times New Roman"/>
-          <w:sz w:val="28"/>
-          <w:szCs w:val="28"/>
-        </w:rPr>
-      </w:pPr>
-    </w:p>
-    <w:p>
+    <w:p ns2:paraId="2EBB7549" ns2:textId="6700ACD7">
+      <w:pPr>
+        <w:spacing w:after="0" w:line="360" w:lineRule="auto"/>
+        <w:jc w:val="both"/>
+        <w:rPr>
+          <w:rFonts w:ascii="Times New Roman" w:eastAsia="Aptos" w:hAnsi="Times New Roman"/>
+          <w:sz w:val="28"/>
+          <w:szCs w:val="28"/>
+        </w:rPr>
+      </w:pPr>
+    </w:p>
+    <w:p ns2:paraId="6B80A386" ns2:textId="31926340">
       <w:pPr>
         <w:spacing w:after="0" w:line="360" w:lineRule="auto"/>
         <w:jc w:val="both"/>
@@ -6441,7 +6441,7 @@
         <w:tab/>
       </w:r>
     </w:p>
-    <w:p>
+    <w:p ns2:paraId="688F3FF8" ns2:textId="77777777">
       <w:pPr>
         <w:spacing w:after="0" w:line="360" w:lineRule="auto"/>
         <w:ind w:firstLine="708"/>
@@ -6465,7 +6465,7 @@
         <w:t>Работа графического интерфейса</w:t>
       </w:r>
     </w:p>
-    <w:p>
+    <w:p ns2:paraId="5A95EDC0" ns2:textId="77777777">
       <w:pPr>
         <w:spacing w:after="0" w:line="360" w:lineRule="auto"/>
         <w:jc w:val="both"/>
@@ -6484,7 +6484,7 @@
         <w:t>После запуска программы создаётся главное окно приложения.</w:t>
       </w:r>
     </w:p>
-    <w:p>
+    <w:p ns2:paraId="44CEC4BA" ns2:textId="77777777">
       <w:pPr>
         <w:spacing w:after="0" w:line="360" w:lineRule="auto"/>
         <w:jc w:val="both"/>
@@ -6503,7 +6503,7 @@
         <w:t>На этапе инициализации выполняются следующие действия:</w:t>
       </w:r>
     </w:p>
-    <w:p>
+    <w:p ns2:paraId="4B5DF593" ns2:textId="77777777">
       <w:pPr>
         <w:spacing w:after="0" w:line="360" w:lineRule="auto"/>
         <w:jc w:val="both"/>
@@ -6575,7 +6575,7 @@
         <w:t>.</w:t>
       </w:r>
     </w:p>
-    <w:p>
+    <w:p ns2:paraId="6EA2F8B8" ns2:textId="77777777">
       <w:pPr>
         <w:spacing w:after="0" w:line="360" w:lineRule="auto"/>
         <w:jc w:val="both"/>
@@ -6667,7 +6667,7 @@
         <w:t>.</w:t>
       </w:r>
     </w:p>
-    <w:p>
+    <w:p ns2:paraId="7D2C8F65" ns2:textId="77777777">
       <w:pPr>
         <w:spacing w:after="0" w:line="360" w:lineRule="auto"/>
         <w:jc w:val="both"/>
@@ -6759,7 +6759,7 @@
         <w:t>.</w:t>
       </w:r>
     </w:p>
-    <w:p>
+    <w:p ns2:paraId="31860CE7" ns2:textId="77777777">
       <w:pPr>
         <w:spacing w:after="0" w:line="360" w:lineRule="auto"/>
         <w:jc w:val="both"/>
@@ -6778,7 +6778,7 @@
         <w:t>Пользователь может открыть диалоговое окно ввода координат и задать новые вершины.</w:t>
       </w:r>
     </w:p>
-    <w:p>
+    <w:p ns2:paraId="7EA9D374" ns2:textId="77777777">
       <w:pPr>
         <w:spacing w:after="0" w:line="360" w:lineRule="auto"/>
         <w:jc w:val="both"/>
@@ -6797,7 +6797,7 @@
         <w:t>После подтверждения введённых данных выполняется:</w:t>
       </w:r>
     </w:p>
-    <w:p>
+    <w:p ns2:paraId="54220BAA" ns2:textId="77777777">
       <w:pPr>
         <w:spacing w:after="0" w:line="360" w:lineRule="auto"/>
         <w:jc w:val="both"/>
@@ -6869,7 +6869,7 @@
         <w:t>;</w:t>
       </w:r>
     </w:p>
-    <w:p>
+    <w:p ns2:paraId="392662C8" ns2:textId="77777777">
       <w:pPr>
         <w:spacing w:after="0" w:line="360" w:lineRule="auto"/>
         <w:jc w:val="both"/>
@@ -6941,7 +6941,7 @@
         <w:t>;</w:t>
       </w:r>
     </w:p>
-    <w:p>
+    <w:p ns2:paraId="10A86D53" ns2:textId="77777777">
       <w:pPr>
         <w:spacing w:after="0" w:line="360" w:lineRule="auto"/>
         <w:jc w:val="both"/>
@@ -7013,7 +7013,7 @@
         <w:t>;</w:t>
       </w:r>
     </w:p>
-    <w:p>
+    <w:p ns2:paraId="2876B463" ns2:textId="77777777">
       <w:pPr>
         <w:spacing w:after="0" w:line="360" w:lineRule="auto"/>
         <w:jc w:val="both"/>
@@ -7065,19 +7065,19 @@
         <w:t>.</w:t>
       </w:r>
     </w:p>
-    <w:p>
-      <w:pPr>
-        <w:spacing w:after="0" w:line="360" w:lineRule="auto"/>
-        <w:jc w:val="both"/>
-        <w:rPr>
-          <w:rFonts w:ascii="Times New Roman" w:eastAsia="Aptos" w:hAnsi="Times New Roman"/>
-          <w:sz w:val="28"/>
-          <w:szCs w:val="28"/>
-          <w:lang w:val="en-US"/>
-        </w:rPr>
-      </w:pPr>
-    </w:p>
-    <w:p>
+    <w:p ns2:paraId="6CF30C62" ns2:textId="3C6E1AA3">
+      <w:pPr>
+        <w:spacing w:after="0" w:line="360" w:lineRule="auto"/>
+        <w:jc w:val="both"/>
+        <w:rPr>
+          <w:rFonts w:ascii="Times New Roman" w:eastAsia="Aptos" w:hAnsi="Times New Roman"/>
+          <w:sz w:val="28"/>
+          <w:szCs w:val="28"/>
+          <w:lang w:val="en-US"/>
+        </w:rPr>
+      </w:pPr>
+    </w:p>
+    <w:p ns2:paraId="432F0450" ns2:textId="77777777">
       <w:pPr>
         <w:spacing w:after="0" w:line="360" w:lineRule="auto"/>
         <w:ind w:firstLine="708"/>
@@ -7099,7 +7099,7 @@
         <w:t>Визуализация результата</w:t>
       </w:r>
     </w:p>
-    <w:p>
+    <w:p ns2:paraId="7DC53C83" ns2:textId="77777777">
       <w:pPr>
         <w:spacing w:after="0" w:line="360" w:lineRule="auto"/>
         <w:jc w:val="both"/>
@@ -7118,7 +7118,7 @@
         <w:t>Каждая вершина отображается в виде окружности.</w:t>
       </w:r>
     </w:p>
-    <w:p>
+    <w:p ns2:paraId="12AF6A6C" ns2:textId="77777777">
       <w:pPr>
         <w:spacing w:after="0" w:line="360" w:lineRule="auto"/>
         <w:jc w:val="both"/>
@@ -7137,7 +7137,7 @@
         <w:t>Рёбра дерева отображаются линиями между соответствующими вершинами.</w:t>
       </w:r>
     </w:p>
-    <w:p>
+    <w:p ns2:paraId="6E927C63" ns2:textId="77777777">
       <w:pPr>
         <w:spacing w:after="0" w:line="360" w:lineRule="auto"/>
         <w:jc w:val="both"/>
@@ -7156,7 +7156,7 @@
         <w:t>Координаты масштабируются для корректного отображения в клиентской области окна.</w:t>
       </w:r>
     </w:p>
-    <w:p>
+    <w:p ns2:paraId="04BAC2ED" ns2:textId="77777777">
       <w:pPr>
         <w:spacing w:after="0" w:line="360" w:lineRule="auto"/>
         <w:jc w:val="both"/>
@@ -7193,7 +7193,7 @@
         <w:t xml:space="preserve"> дерева.</w:t>
       </w:r>
     </w:p>
-    <w:p>
+    <w:p ns2:paraId="0BD4B360" ns2:textId="25E25EE9">
       <w:pPr>
         <w:spacing w:after="0" w:line="360" w:lineRule="auto"/>
         <w:ind w:firstLine="709"/>
@@ -7206,7 +7206,7 @@
         </w:rPr>
       </w:pPr>
     </w:p>
-    <w:p>
+    <w:p ns2:paraId="0D66A5C4" ns2:textId="77777777">
       <w:pPr>
         <w:spacing w:after="0" w:line="360" w:lineRule="auto"/>
         <w:ind w:firstLine="709"/>
@@ -7220,7 +7220,7 @@
       </w:pPr>
     </w:p>
     <w:bookmarkEnd w:id="21"/>
-    <w:p>
+    <w:p ns2:paraId="4804DB88" ns2:textId="77777777">
       <w:pPr>
         <w:spacing w:after="160" w:line="259" w:lineRule="auto"/>
         <w:rPr>
@@ -7238,7 +7238,7 @@
         <w:br w:type="page"/>
       </w:r>
     </w:p>
-    <w:p>
+    <w:p ns2:paraId="79F222F8" ns2:textId="148B889E">
       <w:pPr>
         <w:pStyle w:val="1"/>
         <w:jc w:val="center"/>
@@ -7262,7 +7262,7 @@
       </w:r>
       <w:bookmarkEnd w:id="22"/>
     </w:p>
-    <w:p>
+    <w:p ns2:paraId="4B60106A" ns2:textId="35F3EDB5">
       <w:pPr>
         <w:spacing w:after="0" w:line="360" w:lineRule="auto"/>
         <w:jc w:val="both"/>
@@ -7279,47 +7279,47 @@
           <w:szCs w:val="28"/>
         </w:rPr>
         <w:drawing>
-          <wp:anchor distT="0" distB="0" distL="114300" distR="114300" simplePos="0" relativeHeight="251679744" behindDoc="0" locked="0" layoutInCell="1" allowOverlap="1" wp14:anchorId="7872F80B" wp14:editId="75F50F39">
-            <wp:simplePos x="0" y="0"/>
-            <wp:positionH relativeFrom="column">
-              <wp:posOffset>904875</wp:posOffset>
-            </wp:positionH>
-            <wp:positionV relativeFrom="paragraph">
-              <wp:posOffset>401320</wp:posOffset>
-            </wp:positionV>
-            <wp:extent cx="2895851" cy="2156647"/>
-            <wp:effectExtent l="0" t="0" r="0" b="0"/>
-            <wp:wrapTopAndBottom/>
-            <wp:docPr id="485765213" name="Рисунок 1"/>
-            <wp:cNvGraphicFramePr>
-              <a:graphicFrameLocks xmlns:a="http://schemas.openxmlformats.org/drawingml/2006/main" noChangeAspect="1"/>
-            </wp:cNvGraphicFramePr>
-            <a:graphic xmlns:a="http://schemas.openxmlformats.org/drawingml/2006/main">
-              <a:graphicData uri="http://schemas.openxmlformats.org/drawingml/2006/picture">
-                <pic:pic xmlns:pic="http://schemas.openxmlformats.org/drawingml/2006/picture">
-                  <pic:nvPicPr>
-                    <pic:cNvPr id="485765213" name=""/>
-                    <pic:cNvPicPr/>
-                  </pic:nvPicPr>
-                  <pic:blipFill>
-                    <a:blip r:embed="rId17"/>
-                    <a:stretch>
-                      <a:fillRect/>
-                    </a:stretch>
-                  </pic:blipFill>
-                  <pic:spPr>
-                    <a:xfrm>
-                      <a:off x="0" y="0"/>
-                      <a:ext cx="2895851" cy="2156647"/>
-                    </a:xfrm>
-                    <a:prstGeom prst="rect">
-                      <a:avLst/>
-                    </a:prstGeom>
-                  </pic:spPr>
-                </pic:pic>
-              </a:graphicData>
-            </a:graphic>
-          </wp:anchor>
+          <ns4:anchor distT="0" distB="0" distL="114300" distR="114300" simplePos="0" relativeHeight="251679744" behindDoc="0" locked="0" layoutInCell="1" allowOverlap="1" ns5:anchorId="7872F80B" ns5:editId="75F50F39">
+            <ns4:simplePos x="0" y="0"/>
+            <ns4:positionH relativeFrom="column">
+              <ns4:posOffset>904875</ns4:posOffset>
+            </ns4:positionH>
+            <ns4:positionV relativeFrom="paragraph">
+              <ns4:posOffset>401320</ns4:posOffset>
+            </ns4:positionV>
+            <ns4:extent cx="2895851" cy="2156647"/>
+            <ns4:effectExtent l="0" t="0" r="0" b="0"/>
+            <ns4:wrapTopAndBottom/>
+            <ns4:docPr id="485765213" name="Рисунок 1"/>
+            <ns4:cNvGraphicFramePr>
+              <ns6:graphicFrameLocks noChangeAspect="1"/>
+            </ns4:cNvGraphicFramePr>
+            <ns6:graphic>
+              <ns6:graphicData uri="http://schemas.openxmlformats.org/drawingml/2006/picture">
+                <ns7:pic>
+                  <ns7:nvPicPr>
+                    <ns7:cNvPr id="485765213" name=""/>
+                    <ns7:cNvPicPr/>
+                  </ns7:nvPicPr>
+                  <ns7:blipFill>
+                    <ns6:blip ns3:embed="rId17"/>
+                    <ns6:stretch>
+                      <ns6:fillRect/>
+                    </ns6:stretch>
+                  </ns7:blipFill>
+                  <ns7:spPr>
+                    <ns6:xfrm>
+                      <ns6:off x="0" y="0"/>
+                      <ns6:ext cx="2895851" cy="2156647"/>
+                    </ns6:xfrm>
+                    <ns6:prstGeom prst="rect">
+                      <ns6:avLst/>
+                    </ns6:prstGeom>
+                  </ns7:spPr>
+                </ns7:pic>
+              </ns6:graphicData>
+            </ns6:graphic>
+          </ns4:anchor>
         </w:drawing>
       </w:r>
       <w:r>
@@ -7355,18 +7355,18 @@
         <w:t>:</w:t>
       </w:r>
     </w:p>
-    <w:p>
-      <w:pPr>
-        <w:spacing w:after="0" w:line="360" w:lineRule="auto"/>
-        <w:jc w:val="both"/>
-        <w:rPr>
-          <w:rFonts w:ascii="Times New Roman" w:eastAsia="Aptos" w:hAnsi="Times New Roman"/>
-          <w:sz w:val="28"/>
-          <w:szCs w:val="28"/>
-        </w:rPr>
-      </w:pPr>
-    </w:p>
-    <w:p>
+    <w:p ns2:paraId="7BFDA80B" ns2:textId="621AB739">
+      <w:pPr>
+        <w:spacing w:after="0" w:line="360" w:lineRule="auto"/>
+        <w:jc w:val="both"/>
+        <w:rPr>
+          <w:rFonts w:ascii="Times New Roman" w:eastAsia="Aptos" w:hAnsi="Times New Roman"/>
+          <w:sz w:val="28"/>
+          <w:szCs w:val="28"/>
+        </w:rPr>
+      </w:pPr>
+    </w:p>
+    <w:p ns2:paraId="4072FDBD" ns2:textId="21BA34EC">
       <w:pPr>
         <w:spacing w:after="0" w:line="360" w:lineRule="auto"/>
         <w:jc w:val="both"/>
@@ -7384,47 +7384,47 @@
           <w:lang w:val="en-US"/>
         </w:rPr>
         <w:drawing>
-          <wp:anchor distT="0" distB="0" distL="114300" distR="114300" simplePos="0" relativeHeight="251681792" behindDoc="0" locked="0" layoutInCell="1" allowOverlap="1" wp14:anchorId="3AE4956B" wp14:editId="4D36E8B3">
-            <wp:simplePos x="0" y="0"/>
-            <wp:positionH relativeFrom="column">
-              <wp:posOffset>9525</wp:posOffset>
-            </wp:positionH>
-            <wp:positionV relativeFrom="paragraph">
-              <wp:posOffset>258445</wp:posOffset>
-            </wp:positionV>
-            <wp:extent cx="5940425" cy="4785995"/>
-            <wp:effectExtent l="0" t="0" r="3175" b="0"/>
-            <wp:wrapTopAndBottom/>
-            <wp:docPr id="104227326" name="Рисунок 1"/>
-            <wp:cNvGraphicFramePr>
-              <a:graphicFrameLocks xmlns:a="http://schemas.openxmlformats.org/drawingml/2006/main" noChangeAspect="1"/>
-            </wp:cNvGraphicFramePr>
-            <a:graphic xmlns:a="http://schemas.openxmlformats.org/drawingml/2006/main">
-              <a:graphicData uri="http://schemas.openxmlformats.org/drawingml/2006/picture">
-                <pic:pic xmlns:pic="http://schemas.openxmlformats.org/drawingml/2006/picture">
-                  <pic:nvPicPr>
-                    <pic:cNvPr id="104227326" name=""/>
-                    <pic:cNvPicPr/>
-                  </pic:nvPicPr>
-                  <pic:blipFill>
-                    <a:blip r:embed="rId18"/>
-                    <a:stretch>
-                      <a:fillRect/>
-                    </a:stretch>
-                  </pic:blipFill>
-                  <pic:spPr>
-                    <a:xfrm>
-                      <a:off x="0" y="0"/>
-                      <a:ext cx="5940425" cy="4785995"/>
-                    </a:xfrm>
-                    <a:prstGeom prst="rect">
-                      <a:avLst/>
-                    </a:prstGeom>
-                  </pic:spPr>
-                </pic:pic>
-              </a:graphicData>
-            </a:graphic>
-          </wp:anchor>
+          <ns4:anchor distT="0" distB="0" distL="114300" distR="114300" simplePos="0" relativeHeight="251681792" behindDoc="0" locked="0" layoutInCell="1" allowOverlap="1" ns5:anchorId="3AE4956B" ns5:editId="4D36E8B3">
+            <ns4:simplePos x="0" y="0"/>
+            <ns4:positionH relativeFrom="column">
+              <ns4:posOffset>9525</ns4:posOffset>
+            </ns4:positionH>
+            <ns4:positionV relativeFrom="paragraph">
+              <ns4:posOffset>258445</ns4:posOffset>
+            </ns4:positionV>
+            <ns4:extent cx="5940425" cy="4785995"/>
+            <ns4:effectExtent l="0" t="0" r="3175" b="0"/>
+            <ns4:wrapTopAndBottom/>
+            <ns4:docPr id="104227326" name="Рисунок 1"/>
+            <ns4:cNvGraphicFramePr>
+              <ns6:graphicFrameLocks noChangeAspect="1"/>
+            </ns4:cNvGraphicFramePr>
+            <ns6:graphic>
+              <ns6:graphicData uri="http://schemas.openxmlformats.org/drawingml/2006/picture">
+                <ns7:pic>
+                  <ns7:nvPicPr>
+                    <ns7:cNvPr id="104227326" name=""/>
+                    <ns7:cNvPicPr/>
+                  </ns7:nvPicPr>
+                  <ns7:blipFill>
+                    <ns6:blip ns3:embed="rId18"/>
+                    <ns6:stretch>
+                      <ns6:fillRect/>
+                    </ns6:stretch>
+                  </ns7:blipFill>
+                  <ns7:spPr>
+                    <ns6:xfrm>
+                      <ns6:off x="0" y="0"/>
+                      <ns6:ext cx="5940425" cy="4785995"/>
+                    </ns6:xfrm>
+                    <ns6:prstGeom prst="rect">
+                      <ns6:avLst/>
+                    </ns6:prstGeom>
+                  </ns7:spPr>
+                </ns7:pic>
+              </ns6:graphicData>
+            </ns6:graphic>
+          </ns4:anchor>
         </w:drawing>
       </w:r>
       <w:r>
@@ -7462,40 +7462,40 @@
         <w:t>:</w:t>
       </w:r>
     </w:p>
-    <w:p>
-      <w:pPr>
-        <w:spacing w:after="0" w:line="360" w:lineRule="auto"/>
-        <w:jc w:val="both"/>
-        <w:rPr>
-          <w:rFonts w:ascii="Times New Roman" w:eastAsia="Aptos" w:hAnsi="Times New Roman"/>
-          <w:sz w:val="28"/>
-          <w:szCs w:val="28"/>
-        </w:rPr>
-      </w:pPr>
-    </w:p>
-    <w:p>
-      <w:pPr>
-        <w:spacing w:after="0" w:line="360" w:lineRule="auto"/>
-        <w:jc w:val="both"/>
-        <w:rPr>
-          <w:rFonts w:ascii="Times New Roman" w:eastAsia="Aptos" w:hAnsi="Times New Roman"/>
-          <w:sz w:val="28"/>
-          <w:szCs w:val="28"/>
-        </w:rPr>
-      </w:pPr>
-    </w:p>
-    <w:p>
-      <w:pPr>
-        <w:spacing w:after="0" w:line="360" w:lineRule="auto"/>
-        <w:jc w:val="both"/>
-        <w:rPr>
-          <w:rFonts w:ascii="Times New Roman" w:eastAsia="Aptos" w:hAnsi="Times New Roman"/>
-          <w:sz w:val="28"/>
-          <w:szCs w:val="28"/>
-        </w:rPr>
-      </w:pPr>
-    </w:p>
-    <w:p>
+    <w:p ns2:paraId="10E2E762" ns2:textId="7856BE93">
+      <w:pPr>
+        <w:spacing w:after="0" w:line="360" w:lineRule="auto"/>
+        <w:jc w:val="both"/>
+        <w:rPr>
+          <w:rFonts w:ascii="Times New Roman" w:eastAsia="Aptos" w:hAnsi="Times New Roman"/>
+          <w:sz w:val="28"/>
+          <w:szCs w:val="28"/>
+        </w:rPr>
+      </w:pPr>
+    </w:p>
+    <w:p ns2:paraId="07BA48C0" ns2:textId="77777777">
+      <w:pPr>
+        <w:spacing w:after="0" w:line="360" w:lineRule="auto"/>
+        <w:jc w:val="both"/>
+        <w:rPr>
+          <w:rFonts w:ascii="Times New Roman" w:eastAsia="Aptos" w:hAnsi="Times New Roman"/>
+          <w:sz w:val="28"/>
+          <w:szCs w:val="28"/>
+        </w:rPr>
+      </w:pPr>
+    </w:p>
+    <w:p ns2:paraId="6F1FE6EB" ns2:textId="77777777">
+      <w:pPr>
+        <w:spacing w:after="0" w:line="360" w:lineRule="auto"/>
+        <w:jc w:val="both"/>
+        <w:rPr>
+          <w:rFonts w:ascii="Times New Roman" w:eastAsia="Aptos" w:hAnsi="Times New Roman"/>
+          <w:sz w:val="28"/>
+          <w:szCs w:val="28"/>
+        </w:rPr>
+      </w:pPr>
+    </w:p>
+    <w:p ns2:paraId="06FA24AD" ns2:textId="21EBDC4D">
       <w:pPr>
         <w:spacing w:after="0" w:line="360" w:lineRule="auto"/>
         <w:jc w:val="both"/>
@@ -7523,7 +7523,7 @@
         <w:t>:</w:t>
       </w:r>
     </w:p>
-    <w:p>
+    <w:p ns2:paraId="761F9538" ns2:textId="363FB451">
       <w:pPr>
         <w:spacing w:after="0" w:line="360" w:lineRule="auto"/>
         <w:jc w:val="both"/>
@@ -7540,62 +7540,62 @@
           <w:szCs w:val="28"/>
         </w:rPr>
         <w:drawing>
-          <wp:anchor distT="0" distB="0" distL="114300" distR="114300" simplePos="0" relativeHeight="251683840" behindDoc="0" locked="0" layoutInCell="1" allowOverlap="1" wp14:anchorId="44F55979" wp14:editId="13764CD4">
-            <wp:simplePos x="0" y="0"/>
-            <wp:positionH relativeFrom="column">
-              <wp:posOffset>0</wp:posOffset>
-            </wp:positionH>
-            <wp:positionV relativeFrom="paragraph">
-              <wp:posOffset>304165</wp:posOffset>
-            </wp:positionV>
-            <wp:extent cx="5940425" cy="4581525"/>
-            <wp:effectExtent l="0" t="0" r="3175" b="9525"/>
-            <wp:wrapTopAndBottom/>
-            <wp:docPr id="169120775" name="Рисунок 1"/>
-            <wp:cNvGraphicFramePr>
-              <a:graphicFrameLocks xmlns:a="http://schemas.openxmlformats.org/drawingml/2006/main" noChangeAspect="1"/>
-            </wp:cNvGraphicFramePr>
-            <a:graphic xmlns:a="http://schemas.openxmlformats.org/drawingml/2006/main">
-              <a:graphicData uri="http://schemas.openxmlformats.org/drawingml/2006/picture">
-                <pic:pic xmlns:pic="http://schemas.openxmlformats.org/drawingml/2006/picture">
-                  <pic:nvPicPr>
-                    <pic:cNvPr id="169120775" name=""/>
-                    <pic:cNvPicPr/>
-                  </pic:nvPicPr>
-                  <pic:blipFill>
-                    <a:blip r:embed="rId19"/>
-                    <a:stretch>
-                      <a:fillRect/>
-                    </a:stretch>
-                  </pic:blipFill>
-                  <pic:spPr>
-                    <a:xfrm>
-                      <a:off x="0" y="0"/>
-                      <a:ext cx="5940425" cy="4581525"/>
-                    </a:xfrm>
-                    <a:prstGeom prst="rect">
-                      <a:avLst/>
-                    </a:prstGeom>
-                  </pic:spPr>
-                </pic:pic>
-              </a:graphicData>
-            </a:graphic>
-          </wp:anchor>
+          <ns4:anchor distT="0" distB="0" distL="114300" distR="114300" simplePos="0" relativeHeight="251683840" behindDoc="0" locked="0" layoutInCell="1" allowOverlap="1" ns5:anchorId="44F55979" ns5:editId="13764CD4">
+            <ns4:simplePos x="0" y="0"/>
+            <ns4:positionH relativeFrom="column">
+              <ns4:posOffset>0</ns4:posOffset>
+            </ns4:positionH>
+            <ns4:positionV relativeFrom="paragraph">
+              <ns4:posOffset>304165</ns4:posOffset>
+            </ns4:positionV>
+            <ns4:extent cx="5940425" cy="4581525"/>
+            <ns4:effectExtent l="0" t="0" r="3175" b="9525"/>
+            <ns4:wrapTopAndBottom/>
+            <ns4:docPr id="169120775" name="Рисунок 1"/>
+            <ns4:cNvGraphicFramePr>
+              <ns6:graphicFrameLocks noChangeAspect="1"/>
+            </ns4:cNvGraphicFramePr>
+            <ns6:graphic>
+              <ns6:graphicData uri="http://schemas.openxmlformats.org/drawingml/2006/picture">
+                <ns7:pic>
+                  <ns7:nvPicPr>
+                    <ns7:cNvPr id="169120775" name=""/>
+                    <ns7:cNvPicPr/>
+                  </ns7:nvPicPr>
+                  <ns7:blipFill>
+                    <ns6:blip ns3:embed="rId19"/>
+                    <ns6:stretch>
+                      <ns6:fillRect/>
+                    </ns6:stretch>
+                  </ns7:blipFill>
+                  <ns7:spPr>
+                    <ns6:xfrm>
+                      <ns6:off x="0" y="0"/>
+                      <ns6:ext cx="5940425" cy="4581525"/>
+                    </ns6:xfrm>
+                    <ns6:prstGeom prst="rect">
+                      <ns6:avLst/>
+                    </ns6:prstGeom>
+                  </ns7:spPr>
+                </ns7:pic>
+              </ns6:graphicData>
+            </ns6:graphic>
+          </ns4:anchor>
         </w:drawing>
       </w:r>
     </w:p>
-    <w:p>
-      <w:pPr>
-        <w:spacing w:after="0" w:line="360" w:lineRule="auto"/>
-        <w:jc w:val="both"/>
-        <w:rPr>
-          <w:rFonts w:ascii="Times New Roman" w:eastAsia="Aptos" w:hAnsi="Times New Roman"/>
-          <w:sz w:val="28"/>
-          <w:szCs w:val="28"/>
-        </w:rPr>
-      </w:pPr>
-    </w:p>
-    <w:p>
+    <w:p ns2:paraId="2344D400" ns2:textId="77777777">
+      <w:pPr>
+        <w:spacing w:after="0" w:line="360" w:lineRule="auto"/>
+        <w:jc w:val="both"/>
+        <w:rPr>
+          <w:rFonts w:ascii="Times New Roman" w:eastAsia="Aptos" w:hAnsi="Times New Roman"/>
+          <w:sz w:val="28"/>
+          <w:szCs w:val="28"/>
+        </w:rPr>
+      </w:pPr>
+    </w:p>
+    <w:p ns2:paraId="2B4C2161" ns2:textId="77777777">
       <w:pPr>
         <w:spacing w:after="0" w:line="360" w:lineRule="auto"/>
         <w:ind w:firstLine="709"/>
@@ -7620,6 +7620,82 @@
       </w:r>
     </w:p>
     <w:p>
+      <w:r>
+        <w:rPr>
+          <w:b/>
+        </w:rPr>
+        <w:t xml:space="preserve">Доработка программы после замечаний</w:t>
+      </w:r>
+    </w:p>
+    <w:p>
+      <w:r>
+        <w:t xml:space="preserve">После коммита 9eeb2bef48f088c0a8e29d2b22435e1e95fc3356 программа была дополнена в соответствии с замечаниями по практической работе.</w:t>
+      </w:r>
+    </w:p>
+    <w:p>
+      <w:r>
+        <w:t xml:space="preserve">В первую очередь был уточнён результат работы алгоритма Прима. Алгоритм по-прежнему строит минимальное остовное дерево, но теперь программа дополнительно находит путь между выбранной начальной и конечной вершинами внутри построенного дерева. Для этого в классе Graph добавлены поля path_ и path_length_, а также метод BuildPathFromTree(). На экран выводится не только дерево, но и выделенный путь между выбранными вершинами.</w:t>
+      </w:r>
+    </w:p>
+    <w:p>
+      <w:r>
+        <w:t xml:space="preserve">Также была исправлена ошибка накопления старых рёбер: перед повторным построением дерева очищаются tree_, path_ и списки соседей вершин. Благодаря этому при изменении координат, выборе новых вершин или изменении размера окна результат не смешивается с предыдущим построением.</w:t>
+      </w:r>
+    </w:p>
+    <w:p>
+      <w:r>
+        <w:t xml:space="preserve">Для работы мышью были добавлены отдельные режимы: добавление вершины, выбор начальной вершины и выбор конечной вершины. Режим выбирается через меню программы. В режиме добавления вершины пользователь нажимает мышью в нужной точке окна, после чего координаты клика переводятся в координаты графа и новая вершина добавляется в список coordinates. После этого граф пересоздаётся и путь строится заново.</w:t>
+      </w:r>
+    </w:p>
+    <w:p>
+      <w:r>
+        <w:t xml:space="preserve">Начальная и конечная вершины теперь выбираются через отдельные пункты меню. После выбора вершины программа перестраивает дерево Прима и заново выделяет путь от старта к финишу. Это делает работу программы более похожей на визуализатор алгоритма: пользователь сначала задаёт граф, затем выбирает начальную и конечную вершины, после чего получает результат построения.</w:t>
+      </w:r>
+    </w:p>
+    <w:p>
+      <w:r>
+        <w:t xml:space="preserve">Была доработана визуализация. В окно добавлена координатная сетка, подписи осей X и Y, числовые отметки, номера вершин, подписи START и END. Рёбра дерева Прима отображаются серым цветом, а найденный путь выделяется зелёной линией. В верхней части окна выводится строка состояния: текущий режим, номера начальной и конечной вершин и длина найденного пути.</w:t>
+      </w:r>
+    </w:p>
+    <w:p>
+      <w:r>
+        <w:rPr>
+          <w:b/>
+        </w:rPr>
+        <w:t xml:space="preserve">Список основных коммитов после 9eeb2bef48f088c0a8e29d2b22435e1e95fc3356:</w:t>
+      </w:r>
+    </w:p>
+    <w:p>
+      <w:r>
+        <w:t xml:space="preserve">650b897 — добавлен выбор начальной и конечной вершины, подсветка вершин и отрисовка координатных осей.</w:t>
+      </w:r>
+    </w:p>
+    <w:p>
+      <w:r>
+        <w:t xml:space="preserve">3fa6a4c — добавлен выбор вершин мышью.</w:t>
+      </w:r>
+    </w:p>
+    <w:p>
+      <w:r>
+        <w:t xml:space="preserve">da98f7e — исправлен вывод результата алгоритма Прима: добавлено построение пути между выбранными вершинами по дереву.</w:t>
+      </w:r>
+    </w:p>
+    <w:p>
+      <w:r>
+        <w:t xml:space="preserve">b622954 — добавлены режимы редактирования графа мышью и пункты меню для добавления вершины, выбора старта и выбора конца.</w:t>
+      </w:r>
+    </w:p>
+    <w:p>
+      <w:r>
+        <w:t xml:space="preserve">08cf275 — улучшена отрисовка графа: сетка, оси, номера вершин, подписи START/END, строка состояния и выделение пути.</w:t>
+      </w:r>
+    </w:p>
+    <w:p>
+      <w:r>
+        <w:t xml:space="preserve">После внесения изменений проект был собран в конфигурации Debug|x64. Сборка завершилась успешно, ошибок компиляции не обнаружено.</w:t>
+      </w:r>
+    </w:p>
+    <w:p ns2:paraId="671201FB" ns2:textId="62BCF5BE">
       <w:pPr>
         <w:pStyle w:val="1"/>
         <w:jc w:val="center"/>
@@ -7654,7 +7730,7 @@
       </w:r>
       <w:bookmarkEnd w:id="23"/>
     </w:p>
-    <w:p>
+    <w:p ns2:paraId="04B9078A" ns2:textId="508A5CAC">
       <w:pPr>
         <w:spacing w:after="0" w:line="360" w:lineRule="auto"/>
         <w:ind w:firstLine="709"/>
@@ -7725,7 +7801,7 @@
         <w:t>.</w:t>
       </w:r>
     </w:p>
-    <w:p>
+    <w:p ns2:paraId="4962F9B9" ns2:textId="77777777">
       <w:pPr>
         <w:spacing w:after="0" w:line="360" w:lineRule="auto"/>
         <w:ind w:firstLine="709"/>
@@ -7763,7 +7839,7 @@
         <w:t xml:space="preserve"> дерева методом Прима. Реализованный графический интерфейс позволяет визуально анализировать полученные результаты.</w:t>
       </w:r>
     </w:p>
-    <w:p>
+    <w:p ns2:paraId="0D4C0E9A" ns2:textId="65A03C02">
       <w:pPr>
         <w:spacing w:after="0" w:line="360" w:lineRule="auto"/>
         <w:ind w:firstLine="709"/>
@@ -7800,7 +7876,7 @@
         <w:t>.</w:t>
       </w:r>
     </w:p>
-    <w:p>
+    <w:p ns2:paraId="4706965A" ns2:textId="0B44B353">
       <w:pPr>
         <w:spacing w:after="0" w:line="360" w:lineRule="auto"/>
         <w:ind w:firstLine="709"/>

</xml_diff>